<commit_message>
theory assignment pdf updated
</commit_message>
<xml_diff>
--- a/js/Assignment/js-theory.docx
+++ b/js/Assignment/js-theory.docx
@@ -1399,7 +1399,6 @@
         </w:rPr>
         <w:tab/>
       </w:r>
-      <w:proofErr w:type="gramStart"/>
       <w:r>
         <w:rPr>
           <w:rStyle w:val="t"/>
@@ -1417,7 +1416,6 @@
       <w:r>
         <w:t>log(</w:t>
       </w:r>
-      <w:proofErr w:type="gramEnd"/>
       <w:r>
         <w:rPr>
           <w:rStyle w:val="r"/>
@@ -1489,7 +1487,6 @@
         <w:pStyle w:val="NoSpacing"/>
         <w:ind w:left="1440"/>
       </w:pPr>
-      <w:proofErr w:type="gramStart"/>
       <w:r>
         <w:rPr>
           <w:rStyle w:val="t"/>
@@ -1507,7 +1504,6 @@
       <w:r>
         <w:t>log(</w:t>
       </w:r>
-      <w:proofErr w:type="gramEnd"/>
       <w:r>
         <w:rPr>
           <w:rStyle w:val="r"/>
@@ -1547,14 +1543,12 @@
       <w:r>
         <w:t xml:space="preserve"> </w:t>
       </w:r>
-      <w:proofErr w:type="spellStart"/>
       <w:r>
         <w:rPr>
           <w:rStyle w:val="u"/>
         </w:rPr>
         <w:t>src</w:t>
       </w:r>
-      <w:proofErr w:type="spellEnd"/>
       <w:r>
         <w:rPr>
           <w:rStyle w:val="n"/>
@@ -1621,19 +1615,11 @@
       <w:r>
         <w:tab/>
       </w:r>
-      <w:proofErr w:type="gramStart"/>
       <w:r>
         <w:rPr>
           <w:rStyle w:val="l"/>
         </w:rPr>
-        <w:t>&lt;!--</w:t>
-      </w:r>
-      <w:proofErr w:type="gramEnd"/>
-      <w:r>
-        <w:rPr>
-          <w:rStyle w:val="l"/>
-        </w:rPr>
-        <w:t xml:space="preserve"> content --&gt;</w:t>
+        <w:t>&lt;!-- content --&gt;</w:t>
       </w:r>
       <w:r>
         <w:br/>
@@ -1652,14 +1638,12 @@
       <w:r>
         <w:t xml:space="preserve"> </w:t>
       </w:r>
-      <w:proofErr w:type="spellStart"/>
       <w:r>
         <w:rPr>
           <w:rStyle w:val="u"/>
         </w:rPr>
         <w:t>src</w:t>
       </w:r>
-      <w:proofErr w:type="spellEnd"/>
       <w:r>
         <w:rPr>
           <w:rStyle w:val="n"/>
@@ -1825,15 +1809,7 @@
         <w:ind w:left="2610" w:hanging="1170"/>
       </w:pPr>
       <w:r>
-        <w:t xml:space="preserve">Key Traits: You can update (reassign) the value, but you cannot re-declare it in the same scope. It is hoisted but stays in a "temporal dead zone" until initialized, so accessing it before declaration causes a </w:t>
-      </w:r>
-      <w:proofErr w:type="spellStart"/>
-      <w:r>
-        <w:t>ReferenceError</w:t>
-      </w:r>
-      <w:proofErr w:type="spellEnd"/>
-      <w:r>
-        <w:t xml:space="preserve">. </w:t>
+        <w:t xml:space="preserve">Key Traits: You can update (reassign) the value, but you cannot re-declare it in the same scope. It is hoisted but stays in a "temporal dead zone" until initialized, so accessing it before declaration causes a ReferenceError. </w:t>
       </w:r>
     </w:p>
     <w:p>
@@ -1906,15 +1882,7 @@
         </w:r>
       </w:fldSimple>
       <w:r>
-        <w:t xml:space="preserve"> </w:t>
-      </w:r>
-      <w:proofErr w:type="spellStart"/>
-      <w:r>
-        <w:t>Differende</w:t>
-      </w:r>
-      <w:proofErr w:type="spellEnd"/>
-      <w:r>
-        <w:t xml:space="preserve"> between var, let and const</w:t>
+        <w:t xml:space="preserve"> Differende between var, let and const</w:t>
       </w:r>
     </w:p>
     <w:tbl>
@@ -2095,11 +2063,9 @@
               <w:pStyle w:val="NoSpacing"/>
               <w:ind w:hanging="25"/>
             </w:pPr>
-            <w:proofErr w:type="spellStart"/>
             <w:r>
               <w:t>Reassignable</w:t>
             </w:r>
-            <w:proofErr w:type="spellEnd"/>
           </w:p>
         </w:tc>
         <w:tc>
@@ -2155,11 +2121,9 @@
               <w:pStyle w:val="NoSpacing"/>
               <w:ind w:hanging="25"/>
             </w:pPr>
-            <w:proofErr w:type="spellStart"/>
             <w:r>
               <w:t>Redeclarable</w:t>
             </w:r>
-            <w:proofErr w:type="spellEnd"/>
           </w:p>
         </w:tc>
         <w:tc>
@@ -2300,33 +2264,48 @@
       <w:pPr>
         <w:pStyle w:val="NoSpacing"/>
       </w:pPr>
-      <w:proofErr w:type="spellStart"/>
       <w:r>
         <w:rPr>
           <w:b/>
           <w:bCs/>
         </w:rPr>
-        <w:t>BigInt</w:t>
-      </w:r>
-      <w:proofErr w:type="spellEnd"/>
+        <w:t>BigInt:</w:t>
+      </w:r>
+      <w:r>
+        <w:t xml:space="preserve"> Used for integers larger than the safe limit for the Number type (2</w:t>
+      </w:r>
+      <w:r>
+        <w:rPr>
+          <w:vertAlign w:val="superscript"/>
+        </w:rPr>
+        <w:t>53</w:t>
+      </w:r>
+      <w:r>
+        <w:t xml:space="preserve"> – 1).</w:t>
+      </w:r>
+    </w:p>
+    <w:p>
+      <w:pPr>
+        <w:pStyle w:val="NoSpacing"/>
+        <w:ind w:left="720"/>
+      </w:pPr>
+      <w:r>
+        <w:t>Example: let largeNum = 9007199254740991n;</w:t>
+      </w:r>
+    </w:p>
+    <w:p>
+      <w:pPr>
+        <w:pStyle w:val="NoSpacing"/>
+      </w:pPr>
       <w:r>
         <w:rPr>
           <w:b/>
           <w:bCs/>
         </w:rPr>
-        <w:t>:</w:t>
-      </w:r>
-      <w:r>
-        <w:t xml:space="preserve"> Used for integers larger than the safe limit for the Number type (2</w:t>
-      </w:r>
-      <w:r>
-        <w:rPr>
-          <w:vertAlign w:val="superscript"/>
-        </w:rPr>
-        <w:t>53</w:t>
-      </w:r>
-      <w:r>
-        <w:t xml:space="preserve"> – 1).</w:t>
+        <w:t>Boolean:</w:t>
+      </w:r>
+      <w:r>
+        <w:t xml:space="preserve"> Represents logical entities with only two values: true or false.</w:t>
       </w:r>
     </w:p>
     <w:p>
@@ -2335,15 +2314,7 @@
         <w:ind w:left="720"/>
       </w:pPr>
       <w:r>
-        <w:t xml:space="preserve">Example: let </w:t>
-      </w:r>
-      <w:proofErr w:type="spellStart"/>
-      <w:r>
-        <w:t>largeNum</w:t>
-      </w:r>
-      <w:proofErr w:type="spellEnd"/>
-      <w:r>
-        <w:t xml:space="preserve"> = 9007199254740991n;</w:t>
+        <w:t>Example: let isVisible = true;</w:t>
       </w:r>
     </w:p>
     <w:p>
@@ -2355,10 +2326,10 @@
           <w:b/>
           <w:bCs/>
         </w:rPr>
-        <w:t>Boolean:</w:t>
-      </w:r>
-      <w:r>
-        <w:t xml:space="preserve"> Represents logical entities with only two values: true or false.</w:t>
+        <w:t>Undefined:</w:t>
+      </w:r>
+      <w:r>
+        <w:t xml:space="preserve"> A variable that has been declared but not yet assigned a value.</w:t>
       </w:r>
     </w:p>
     <w:p>
@@ -2367,15 +2338,7 @@
         <w:ind w:left="720"/>
       </w:pPr>
       <w:r>
-        <w:t xml:space="preserve">Example: let </w:t>
-      </w:r>
-      <w:proofErr w:type="spellStart"/>
-      <w:r>
-        <w:t>isVisible</w:t>
-      </w:r>
-      <w:proofErr w:type="spellEnd"/>
-      <w:r>
-        <w:t xml:space="preserve"> = true;</w:t>
+        <w:t>Example: let x; // x is undefined</w:t>
       </w:r>
     </w:p>
     <w:p>
@@ -2387,10 +2350,10 @@
           <w:b/>
           <w:bCs/>
         </w:rPr>
-        <w:t>Undefined:</w:t>
-      </w:r>
-      <w:r>
-        <w:t xml:space="preserve"> A variable that has been declared but not yet assigned a value.</w:t>
+        <w:t>Null:</w:t>
+      </w:r>
+      <w:r>
+        <w:t xml:space="preserve"> Represents the intentional absence of any object value.</w:t>
       </w:r>
     </w:p>
     <w:p>
@@ -2399,7 +2362,7 @@
         <w:ind w:left="720"/>
       </w:pPr>
       <w:r>
-        <w:t>Example: let x; // x is undefined</w:t>
+        <w:t>Example: let user = null;</w:t>
       </w:r>
     </w:p>
     <w:p>
@@ -2411,10 +2374,10 @@
           <w:b/>
           <w:bCs/>
         </w:rPr>
-        <w:t>Null:</w:t>
-      </w:r>
-      <w:r>
-        <w:t xml:space="preserve"> Represents the intentional absence of any object value.</w:t>
+        <w:t>Symbol:</w:t>
+      </w:r>
+      <w:r>
+        <w:t xml:space="preserve"> Represents a unique and immutable identifier, often used as object property keys.</w:t>
       </w:r>
     </w:p>
     <w:p>
@@ -2423,78 +2386,78 @@
         <w:ind w:left="720"/>
       </w:pPr>
       <w:r>
-        <w:t>Example: let user = null;</w:t>
-      </w:r>
-    </w:p>
-    <w:p>
-      <w:pPr>
-        <w:pStyle w:val="NoSpacing"/>
-      </w:pPr>
-      <w:r>
+        <w:t xml:space="preserve">Example: let id = Symbol("id"); </w:t>
+      </w:r>
+    </w:p>
+    <w:p>
+      <w:pPr>
+        <w:pStyle w:val="NoSpacing"/>
+        <w:ind w:left="720"/>
+      </w:pPr>
+    </w:p>
+    <w:p>
+      <w:pPr>
+        <w:pStyle w:val="NoSpacing"/>
+        <w:ind w:firstLine="0"/>
         <w:rPr>
           <w:b/>
           <w:bCs/>
         </w:rPr>
-        <w:t>Symbol:</w:t>
-      </w:r>
-      <w:r>
-        <w:t xml:space="preserve"> Represents a unique and immutable identifier, often used as object property keys.</w:t>
-      </w:r>
-    </w:p>
-    <w:p>
-      <w:pPr>
-        <w:pStyle w:val="NoSpacing"/>
-        <w:ind w:left="720"/>
-      </w:pPr>
-      <w:r>
-        <w:t xml:space="preserve">Example: let id = Symbol("id"); </w:t>
-      </w:r>
-    </w:p>
-    <w:p>
-      <w:pPr>
-        <w:pStyle w:val="NoSpacing"/>
-        <w:ind w:left="720"/>
-      </w:pPr>
-    </w:p>
-    <w:p>
-      <w:pPr>
-        <w:pStyle w:val="NoSpacing"/>
-        <w:ind w:firstLine="0"/>
+      </w:pPr>
+      <w:r>
         <w:rPr>
           <w:b/>
           <w:bCs/>
         </w:rPr>
+        <w:t>2. Non-Primitive (Reference) Data Types</w:t>
+      </w:r>
+    </w:p>
+    <w:p>
+      <w:pPr>
+        <w:pStyle w:val="NoSpacing"/>
+      </w:pPr>
+      <w:r>
+        <w:t xml:space="preserve">Non-primitive types are complex data structures that store collections of values and are accessed by reference. </w:t>
+      </w:r>
+    </w:p>
+    <w:p>
+      <w:pPr>
+        <w:pStyle w:val="NoSpacing"/>
+        <w:ind w:left="1530" w:hanging="810"/>
       </w:pPr>
       <w:r>
         <w:rPr>
           <w:b/>
           <w:bCs/>
         </w:rPr>
-        <w:t>2. Non-Primitive (Reference) Data Types</w:t>
-      </w:r>
-    </w:p>
-    <w:p>
-      <w:pPr>
-        <w:pStyle w:val="NoSpacing"/>
-      </w:pPr>
-      <w:r>
-        <w:t xml:space="preserve">Non-primitive types are complex data structures that store collections of values and are accessed by reference. </w:t>
-      </w:r>
-    </w:p>
-    <w:p>
-      <w:pPr>
-        <w:pStyle w:val="NoSpacing"/>
-        <w:ind w:left="1530" w:hanging="810"/>
+        <w:t>Object:</w:t>
+      </w:r>
+      <w:r>
+        <w:t xml:space="preserve"> A collection of key-value pairs where keys are strings or symbols and values can be any type.</w:t>
+      </w:r>
+    </w:p>
+    <w:p>
+      <w:pPr>
+        <w:pStyle w:val="NoSpacing"/>
+        <w:ind w:left="720"/>
+      </w:pPr>
+      <w:r>
+        <w:t>Example: let person = { name: "Bob", age: 25 };</w:t>
+      </w:r>
+    </w:p>
+    <w:p>
+      <w:pPr>
+        <w:pStyle w:val="NoSpacing"/>
       </w:pPr>
       <w:r>
         <w:rPr>
           <w:b/>
           <w:bCs/>
         </w:rPr>
-        <w:t>Object:</w:t>
-      </w:r>
-      <w:r>
-        <w:t xml:space="preserve"> A collection of key-value pairs where keys are strings or symbols and values can be any type.</w:t>
+        <w:t>Array:</w:t>
+      </w:r>
+      <w:r>
+        <w:t xml:space="preserve"> A specialized type of object used to store ordered lists of data.</w:t>
       </w:r>
     </w:p>
     <w:p>
@@ -2503,23 +2466,7 @@
         <w:ind w:left="720"/>
       </w:pPr>
       <w:r>
-        <w:t xml:space="preserve">Example: let person = </w:t>
-      </w:r>
-      <w:proofErr w:type="gramStart"/>
-      <w:r>
-        <w:t>{ name</w:t>
-      </w:r>
-      <w:proofErr w:type="gramEnd"/>
-      <w:r>
-        <w:t xml:space="preserve">: "Bob", age: </w:t>
-      </w:r>
-      <w:proofErr w:type="gramStart"/>
-      <w:r>
-        <w:t>25 }</w:t>
-      </w:r>
-      <w:proofErr w:type="gramEnd"/>
-      <w:r>
-        <w:t>;</w:t>
+        <w:t>Example: let colors = ["red", "green", "blue"];</w:t>
       </w:r>
     </w:p>
     <w:p>
@@ -2531,10 +2478,10 @@
           <w:b/>
           <w:bCs/>
         </w:rPr>
-        <w:t>Array:</w:t>
-      </w:r>
-      <w:r>
-        <w:t xml:space="preserve"> A specialized type of object used to store ordered lists of data.</w:t>
+        <w:t>Function:</w:t>
+      </w:r>
+      <w:r>
+        <w:t xml:space="preserve"> Reusable blocks of code that can be assigned to variables and passed around as objects.</w:t>
       </w:r>
     </w:p>
     <w:p>
@@ -2543,53 +2490,8 @@
         <w:ind w:left="720"/>
       </w:pPr>
       <w:r>
-        <w:t>Example: let colors = ["red", "green", "blue"];</w:t>
-      </w:r>
-    </w:p>
-    <w:p>
-      <w:pPr>
-        <w:pStyle w:val="NoSpacing"/>
-      </w:pPr>
-      <w:r>
-        <w:rPr>
-          <w:b/>
-          <w:bCs/>
-        </w:rPr>
-        <w:t>Function:</w:t>
-      </w:r>
-      <w:r>
-        <w:t xml:space="preserve"> Reusable blocks of code that can be assigned to variables and passed around as objects.</w:t>
-      </w:r>
-    </w:p>
-    <w:p>
-      <w:pPr>
-        <w:pStyle w:val="NoSpacing"/>
-        <w:ind w:left="720"/>
-      </w:pPr>
-      <w:r>
-        <w:t xml:space="preserve">Example: function </w:t>
-      </w:r>
-      <w:proofErr w:type="gramStart"/>
-      <w:r>
-        <w:t>greet(</w:t>
-      </w:r>
-      <w:proofErr w:type="gramEnd"/>
-      <w:r>
-        <w:t xml:space="preserve">) </w:t>
-      </w:r>
-      <w:proofErr w:type="gramStart"/>
-      <w:r>
-        <w:t>{ return</w:t>
-      </w:r>
-      <w:proofErr w:type="gramEnd"/>
-      <w:r>
-        <w:t xml:space="preserve"> "Hello!"</w:t>
-      </w:r>
-      <w:proofErr w:type="gramStart"/>
-      <w:r>
-        <w:t>; }</w:t>
-      </w:r>
-      <w:proofErr w:type="gramEnd"/>
+        <w:t>Example: function greet() { return "Hello!"; }</w:t>
+      </w:r>
     </w:p>
     <w:p/>
     <w:p/>
@@ -2725,15 +2627,7 @@
         </w:r>
       </w:fldSimple>
       <w:r>
-        <w:t xml:space="preserve"> </w:t>
-      </w:r>
-      <w:proofErr w:type="gramStart"/>
-      <w:r>
-        <w:t>Comparison  between</w:t>
-      </w:r>
-      <w:proofErr w:type="gramEnd"/>
-      <w:r>
-        <w:t xml:space="preserve"> undefined and null</w:t>
+        <w:t xml:space="preserve"> Comparison  between undefined and null</w:t>
       </w:r>
     </w:p>
     <w:tbl>
@@ -2927,15 +2821,7 @@
               <w:ind w:firstLine="0"/>
             </w:pPr>
             <w:r>
-              <w:t>Type (</w:t>
-            </w:r>
-            <w:proofErr w:type="spellStart"/>
-            <w:r>
-              <w:t>typeof</w:t>
-            </w:r>
-            <w:proofErr w:type="spellEnd"/>
-            <w:r>
-              <w:t>)</w:t>
+              <w:t>Type (typeof)</w:t>
             </w:r>
           </w:p>
         </w:tc>
@@ -2997,13 +2883,8 @@
               <w:ind w:firstLine="0"/>
             </w:pPr>
             <w:r>
-              <w:t xml:space="preserve">Converts to </w:t>
+              <w:t>Converts to NaN</w:t>
             </w:r>
-            <w:proofErr w:type="spellStart"/>
-            <w:r>
-              <w:t>NaN</w:t>
-            </w:r>
-            <w:proofErr w:type="spellEnd"/>
           </w:p>
         </w:tc>
         <w:tc>
@@ -3571,15 +3452,7 @@
         <w:pStyle w:val="NoSpacing"/>
       </w:pPr>
       <w:r>
-        <w:t xml:space="preserve">These operators compare two values and return a </w:t>
-      </w:r>
-      <w:proofErr w:type="spellStart"/>
-      <w:r>
-        <w:t>boolean</w:t>
-      </w:r>
-      <w:proofErr w:type="spellEnd"/>
-      <w:r>
-        <w:t xml:space="preserve"> result: true or false. </w:t>
+        <w:t xml:space="preserve">These operators compare two values and return a boolean result: true or false. </w:t>
       </w:r>
     </w:p>
     <w:p>
@@ -3672,58 +3545,26 @@
           <w:bCs/>
         </w:rPr>
         <w:lastRenderedPageBreak/>
-        <w:t xml:space="preserve">Not Equal </w:t>
-      </w:r>
-      <w:proofErr w:type="gramStart"/>
-      <w:r>
+        <w:t>Not Equal (!=) &amp; Strict Not Equal (!==):</w:t>
+      </w:r>
+      <w:r>
+        <w:t xml:space="preserve"> Checks for inequality, either with or without type conversion. </w:t>
+      </w:r>
+    </w:p>
+    <w:p>
+      <w:pPr>
+        <w:pStyle w:val="NoSpacing"/>
+        <w:ind w:firstLine="0"/>
         <w:rPr>
           <w:b/>
           <w:bCs/>
         </w:rPr>
-        <w:t>(!=</w:t>
-      </w:r>
-      <w:proofErr w:type="gramEnd"/>
+      </w:pPr>
       <w:r>
         <w:rPr>
           <w:b/>
           <w:bCs/>
         </w:rPr>
-        <w:t xml:space="preserve">) &amp; Strict Not Equal </w:t>
-      </w:r>
-      <w:proofErr w:type="gramStart"/>
-      <w:r>
-        <w:rPr>
-          <w:b/>
-          <w:bCs/>
-        </w:rPr>
-        <w:t>(!=</w:t>
-      </w:r>
-      <w:proofErr w:type="gramEnd"/>
-      <w:r>
-        <w:rPr>
-          <w:b/>
-          <w:bCs/>
-        </w:rPr>
-        <w:t>=):</w:t>
-      </w:r>
-      <w:r>
-        <w:t xml:space="preserve"> Checks for inequality, either with or without type conversion. </w:t>
-      </w:r>
-    </w:p>
-    <w:p>
-      <w:pPr>
-        <w:pStyle w:val="NoSpacing"/>
-        <w:ind w:firstLine="0"/>
-        <w:rPr>
-          <w:b/>
-          <w:bCs/>
-        </w:rPr>
-      </w:pPr>
-      <w:r>
-        <w:rPr>
-          <w:b/>
-          <w:bCs/>
-        </w:rPr>
         <w:t>4. Logical Operators</w:t>
       </w:r>
     </w:p>
@@ -3732,15 +3573,7 @@
         <w:pStyle w:val="NoSpacing"/>
       </w:pPr>
       <w:r>
-        <w:t xml:space="preserve">Logical operators combine multiple conditions or invert </w:t>
-      </w:r>
-      <w:proofErr w:type="spellStart"/>
-      <w:r>
-        <w:t>boolean</w:t>
-      </w:r>
-      <w:proofErr w:type="spellEnd"/>
-      <w:r>
-        <w:t xml:space="preserve"> values. </w:t>
+        <w:t xml:space="preserve">Logical operators combine multiple conditions or invert boolean values. </w:t>
       </w:r>
     </w:p>
     <w:p>
@@ -3797,23 +3630,7 @@
         <w:t>Logical NOT (!):</w:t>
       </w:r>
       <w:r>
-        <w:t xml:space="preserve"> Reverses the </w:t>
-      </w:r>
-      <w:proofErr w:type="spellStart"/>
-      <w:r>
-        <w:t>boolean</w:t>
-      </w:r>
-      <w:proofErr w:type="spellEnd"/>
-      <w:r>
-        <w:t xml:space="preserve"> value. (e.g.</w:t>
-      </w:r>
-      <w:proofErr w:type="gramStart"/>
-      <w:r>
-        <w:t>, !true</w:t>
-      </w:r>
-      <w:proofErr w:type="gramEnd"/>
-      <w:r>
-        <w:t xml:space="preserve"> becomes false).</w:t>
+        <w:t xml:space="preserve"> Reverses the boolean value. (e.g., !true becomes false).</w:t>
       </w:r>
     </w:p>
     <w:p>
@@ -4325,15 +4142,7 @@
         <w:t>else block:</w:t>
       </w:r>
       <w:r>
-        <w:t xml:space="preserve"> This optional section only runs if the condition is </w:t>
-      </w:r>
-      <w:proofErr w:type="spellStart"/>
-      <w:r>
-        <w:t>falsy</w:t>
-      </w:r>
-      <w:proofErr w:type="spellEnd"/>
-      <w:r>
-        <w:t xml:space="preserve"> (something that behaves like false). </w:t>
+        <w:t xml:space="preserve"> This optional section only runs if the condition is falsy (something that behaves like false). </w:t>
       </w:r>
     </w:p>
     <w:p>
@@ -4392,15 +4201,7 @@
         <w:ind w:left="720"/>
       </w:pPr>
       <w:r>
-        <w:t xml:space="preserve">  </w:t>
-      </w:r>
-      <w:proofErr w:type="gramStart"/>
-      <w:r>
-        <w:t>console.log(</w:t>
-      </w:r>
-      <w:proofErr w:type="gramEnd"/>
-      <w:r>
-        <w:t>"You are an adult.");</w:t>
+        <w:t xml:space="preserve">  console.log("You are an adult.");</w:t>
       </w:r>
     </w:p>
     <w:p>
@@ -4427,15 +4228,7 @@
         <w:ind w:left="720"/>
       </w:pPr>
       <w:r>
-        <w:t xml:space="preserve">  </w:t>
-      </w:r>
-      <w:proofErr w:type="gramStart"/>
-      <w:r>
-        <w:t>console.log(</w:t>
-      </w:r>
-      <w:proofErr w:type="gramEnd"/>
-      <w:r>
-        <w:t>"You are a minor.");</w:t>
+        <w:t xml:space="preserve">  console.log("You are a minor.");</w:t>
       </w:r>
     </w:p>
     <w:p>
@@ -4923,15 +4716,7 @@
         <w:t>Flexibility:</w:t>
       </w:r>
       <w:r>
-        <w:t xml:space="preserve"> If-else is far more flexible, as it can evaluate any expression that results in a </w:t>
-      </w:r>
-      <w:proofErr w:type="spellStart"/>
-      <w:r>
-        <w:t>boolean</w:t>
-      </w:r>
-      <w:proofErr w:type="spellEnd"/>
-      <w:r>
-        <w:t xml:space="preserve"> value.</w:t>
+        <w:t xml:space="preserve"> If-else is far more flexible, as it can evaluate any expression that results in a boolean value.</w:t>
       </w:r>
     </w:p>
     <w:p>
@@ -5196,122 +4981,58 @@
         <w:rPr>
           <w:rStyle w:val="undefined"/>
         </w:rPr>
-        <w:t xml:space="preserve"> </w:t>
-      </w:r>
-      <w:proofErr w:type="spellStart"/>
+        <w:t xml:space="preserve"> i = </w:t>
+      </w:r>
+      <w:r>
+        <w:rPr>
+          <w:rStyle w:val="tnfccf"/>
+        </w:rPr>
+        <w:t>0</w:t>
+      </w:r>
       <w:r>
         <w:rPr>
           <w:rStyle w:val="undefined"/>
         </w:rPr>
-        <w:t>i</w:t>
-      </w:r>
-      <w:proofErr w:type="spellEnd"/>
+        <w:t xml:space="preserve">; i &lt; </w:t>
+      </w:r>
+      <w:r>
+        <w:rPr>
+          <w:rStyle w:val="tnfccf"/>
+        </w:rPr>
+        <w:t>5</w:t>
+      </w:r>
       <w:r>
         <w:rPr>
           <w:rStyle w:val="undefined"/>
         </w:rPr>
-        <w:t xml:space="preserve"> = </w:t>
-      </w:r>
-      <w:r>
-        <w:rPr>
-          <w:rStyle w:val="tnfccf"/>
-        </w:rPr>
-        <w:t>0</w:t>
-      </w:r>
-      <w:r>
+        <w:t>; i++) {</w:t>
+      </w:r>
+    </w:p>
+    <w:p>
+      <w:pPr>
+        <w:pStyle w:val="NoSpacing"/>
+        <w:ind w:left="720"/>
         <w:rPr>
           <w:rStyle w:val="undefined"/>
         </w:rPr>
-        <w:t xml:space="preserve">; </w:t>
-      </w:r>
-      <w:proofErr w:type="spellStart"/>
+      </w:pPr>
       <w:r>
         <w:rPr>
           <w:rStyle w:val="undefined"/>
         </w:rPr>
-        <w:t>i</w:t>
-      </w:r>
-      <w:proofErr w:type="spellEnd"/>
+        <w:t xml:space="preserve">  console.log(</w:t>
+      </w:r>
+      <w:r>
+        <w:rPr>
+          <w:rStyle w:val="cs0cqb"/>
+        </w:rPr>
+        <w:t>"Iteration:"</w:t>
+      </w:r>
       <w:r>
         <w:rPr>
           <w:rStyle w:val="undefined"/>
         </w:rPr>
-        <w:t xml:space="preserve"> &lt; </w:t>
-      </w:r>
-      <w:r>
-        <w:rPr>
-          <w:rStyle w:val="tnfccf"/>
-        </w:rPr>
-        <w:t>5</w:t>
-      </w:r>
-      <w:r>
-        <w:rPr>
-          <w:rStyle w:val="undefined"/>
-        </w:rPr>
-        <w:t xml:space="preserve">; </w:t>
-      </w:r>
-      <w:proofErr w:type="spellStart"/>
-      <w:r>
-        <w:rPr>
-          <w:rStyle w:val="undefined"/>
-        </w:rPr>
-        <w:t>i</w:t>
-      </w:r>
-      <w:proofErr w:type="spellEnd"/>
-      <w:r>
-        <w:rPr>
-          <w:rStyle w:val="undefined"/>
-        </w:rPr>
-        <w:t>++) {</w:t>
-      </w:r>
-    </w:p>
-    <w:p>
-      <w:pPr>
-        <w:pStyle w:val="NoSpacing"/>
-        <w:ind w:left="720"/>
-        <w:rPr>
-          <w:rStyle w:val="undefined"/>
-        </w:rPr>
-      </w:pPr>
-      <w:r>
-        <w:rPr>
-          <w:rStyle w:val="undefined"/>
-        </w:rPr>
-        <w:t xml:space="preserve">  </w:t>
-      </w:r>
-      <w:proofErr w:type="gramStart"/>
-      <w:r>
-        <w:rPr>
-          <w:rStyle w:val="undefined"/>
-        </w:rPr>
-        <w:t>console.log(</w:t>
-      </w:r>
-      <w:proofErr w:type="gramEnd"/>
-      <w:r>
-        <w:rPr>
-          <w:rStyle w:val="cs0cqb"/>
-        </w:rPr>
-        <w:t>"Iteration:"</w:t>
-      </w:r>
-      <w:r>
-        <w:rPr>
-          <w:rStyle w:val="undefined"/>
-        </w:rPr>
-        <w:t xml:space="preserve">, </w:t>
-      </w:r>
-      <w:proofErr w:type="spellStart"/>
-      <w:r>
-        <w:rPr>
-          <w:rStyle w:val="undefined"/>
-        </w:rPr>
-        <w:t>i</w:t>
-      </w:r>
-      <w:proofErr w:type="spellEnd"/>
-      <w:r>
-        <w:rPr>
-          <w:rStyle w:val="undefined"/>
-        </w:rPr>
-        <w:t>);</w:t>
+        <w:t>, i);</w:t>
       </w:r>
     </w:p>
     <w:p>
@@ -5579,16 +5300,8 @@
         <w:rPr>
           <w:rStyle w:val="undefined"/>
         </w:rPr>
-        <w:t xml:space="preserve">  </w:t>
-      </w:r>
-      <w:proofErr w:type="gramStart"/>
-      <w:r>
-        <w:rPr>
-          <w:rStyle w:val="undefined"/>
-        </w:rPr>
-        <w:t>console.log(</w:t>
-      </w:r>
-      <w:proofErr w:type="gramEnd"/>
+        <w:t xml:space="preserve">  console.log(</w:t>
+      </w:r>
       <w:r>
         <w:rPr>
           <w:rStyle w:val="cs0cqb"/>
@@ -5908,16 +5621,8 @@
         <w:rPr>
           <w:rStyle w:val="undefined"/>
         </w:rPr>
-        <w:t xml:space="preserve">  </w:t>
-      </w:r>
-      <w:proofErr w:type="gramStart"/>
-      <w:r>
-        <w:rPr>
-          <w:rStyle w:val="undefined"/>
-        </w:rPr>
-        <w:t>console.log(</w:t>
-      </w:r>
-      <w:proofErr w:type="gramEnd"/>
+        <w:t xml:space="preserve">  console.log(</w:t>
+      </w:r>
       <w:r>
         <w:rPr>
           <w:rStyle w:val="cs0cqb"/>
@@ -6430,21 +6135,7 @@
               <w:rPr>
                 <w:rFonts w:eastAsiaTheme="majorEastAsia"/>
               </w:rPr>
-              <w:t xml:space="preserve">while(condition) </w:t>
-            </w:r>
-            <w:proofErr w:type="gramStart"/>
-            <w:r>
-              <w:rPr>
-                <w:rFonts w:eastAsiaTheme="majorEastAsia"/>
-              </w:rPr>
-              <w:t>{ ...</w:t>
-            </w:r>
-            <w:proofErr w:type="gramEnd"/>
-            <w:r>
-              <w:rPr>
-                <w:rFonts w:eastAsiaTheme="majorEastAsia"/>
-              </w:rPr>
-              <w:t xml:space="preserve"> }</w:t>
+              <w:t>while(condition) { ... }</w:t>
             </w:r>
           </w:p>
         </w:tc>
@@ -6462,21 +6153,7 @@
               <w:rPr>
                 <w:rFonts w:eastAsiaTheme="majorEastAsia"/>
               </w:rPr>
-              <w:t xml:space="preserve">do </w:t>
-            </w:r>
-            <w:proofErr w:type="gramStart"/>
-            <w:r>
-              <w:rPr>
-                <w:rFonts w:eastAsiaTheme="majorEastAsia"/>
-              </w:rPr>
-              <w:t>{ ...</w:t>
-            </w:r>
-            <w:proofErr w:type="gramEnd"/>
-            <w:r>
-              <w:rPr>
-                <w:rFonts w:eastAsiaTheme="majorEastAsia"/>
-              </w:rPr>
-              <w:t xml:space="preserve"> } while(condition);</w:t>
+              <w:t>do { ... } while(condition);</w:t>
             </w:r>
           </w:p>
         </w:tc>
@@ -7371,13 +7048,8 @@
         <w:pStyle w:val="NoSpacing"/>
         <w:ind w:left="720"/>
       </w:pPr>
-      <w:proofErr w:type="gramStart"/>
-      <w:r>
-        <w:t>greet(</w:t>
-      </w:r>
-      <w:proofErr w:type="gramEnd"/>
-      <w:r>
-        <w:t>); // Works due to hoisting</w:t>
+      <w:r>
+        <w:t>greet(); // Works due to hoisting</w:t>
       </w:r>
     </w:p>
     <w:p>
@@ -7386,15 +7058,7 @@
         <w:ind w:left="720"/>
       </w:pPr>
       <w:r>
-        <w:t xml:space="preserve">function </w:t>
-      </w:r>
-      <w:proofErr w:type="gramStart"/>
-      <w:r>
-        <w:t>greet(</w:t>
-      </w:r>
-      <w:proofErr w:type="gramEnd"/>
-      <w:r>
-        <w:t>) {</w:t>
+        <w:t>function greet() {</w:t>
       </w:r>
     </w:p>
     <w:p>
@@ -7483,26 +7147,8 @@
         <w:pStyle w:val="NoSpacing"/>
         <w:ind w:left="720"/>
       </w:pPr>
-      <w:proofErr w:type="spellStart"/>
-      <w:proofErr w:type="gramStart"/>
-      <w:r>
-        <w:t>sayHi</w:t>
-      </w:r>
-      <w:proofErr w:type="spellEnd"/>
-      <w:r>
-        <w:t>(</w:t>
-      </w:r>
-      <w:proofErr w:type="gramEnd"/>
-      <w:r>
-        <w:t>); // Error: Cannot access '</w:t>
-      </w:r>
-      <w:proofErr w:type="spellStart"/>
-      <w:r>
-        <w:t>sayHi</w:t>
-      </w:r>
-      <w:proofErr w:type="spellEnd"/>
-      <w:r>
-        <w:t>' before initialization</w:t>
+      <w:r>
+        <w:t>sayHi(); // Error: Cannot access 'sayHi' before initialization</w:t>
       </w:r>
     </w:p>
     <w:p>
@@ -7511,23 +7157,7 @@
         <w:ind w:left="720"/>
       </w:pPr>
       <w:r>
-        <w:t xml:space="preserve">const </w:t>
-      </w:r>
-      <w:proofErr w:type="spellStart"/>
-      <w:r>
-        <w:t>sayHi</w:t>
-      </w:r>
-      <w:proofErr w:type="spellEnd"/>
-      <w:r>
-        <w:t xml:space="preserve"> = </w:t>
-      </w:r>
-      <w:proofErr w:type="gramStart"/>
-      <w:r>
-        <w:t>function(</w:t>
-      </w:r>
-      <w:proofErr w:type="gramEnd"/>
-      <w:r>
-        <w:t>) {</w:t>
+        <w:t>const sayHi = function() {</w:t>
       </w:r>
     </w:p>
     <w:p>
@@ -7785,15 +7415,7 @@
         <w:t>Communication:</w:t>
       </w:r>
       <w:r>
-        <w:t xml:space="preserve"> Unlike </w:t>
-      </w:r>
-      <w:proofErr w:type="gramStart"/>
-      <w:r>
-        <w:t>print(</w:t>
-      </w:r>
-      <w:proofErr w:type="gramEnd"/>
-      <w:r>
-        <w:t>), which just displays text on a screen, a return value allows the program to store the result in a variable or use it in further calculations.</w:t>
+        <w:t xml:space="preserve"> Unlike print(), which just displays text on a screen, a return value allows the program to store the result in a variable or use it in further calculations.</w:t>
       </w:r>
     </w:p>
     <w:p>
@@ -8006,15 +7628,7 @@
         <w:ind w:left="1440"/>
       </w:pPr>
       <w:r>
-        <w:t xml:space="preserve">const </w:t>
-      </w:r>
-      <w:proofErr w:type="spellStart"/>
-      <w:r>
-        <w:t>emptyArray</w:t>
-      </w:r>
-      <w:proofErr w:type="spellEnd"/>
-      <w:r>
-        <w:t xml:space="preserve"> = [];</w:t>
+        <w:t>const emptyArray = [];</w:t>
       </w:r>
     </w:p>
     <w:p>
@@ -8064,15 +7678,7 @@
         <w:ind w:left="720"/>
       </w:pPr>
       <w:r>
-        <w:t xml:space="preserve">This method uses the new </w:t>
-      </w:r>
-      <w:proofErr w:type="gramStart"/>
-      <w:r>
-        <w:t>Array(</w:t>
-      </w:r>
-      <w:proofErr w:type="gramEnd"/>
-      <w:r>
-        <w:t xml:space="preserve">) constructor. It is generally less common but still valid. </w:t>
+        <w:t xml:space="preserve">This method uses the new Array() constructor. It is generally less common but still valid. </w:t>
       </w:r>
     </w:p>
     <w:p>
@@ -8090,15 +7696,7 @@
         <w:ind w:left="1440"/>
       </w:pPr>
       <w:r>
-        <w:t xml:space="preserve">const numbers = new </w:t>
-      </w:r>
-      <w:proofErr w:type="gramStart"/>
-      <w:r>
-        <w:t>Array(</w:t>
-      </w:r>
-      <w:proofErr w:type="gramEnd"/>
-      <w:r>
-        <w:t>10, 20, 30);</w:t>
+        <w:t>const numbers = new Array(10, 20, 30);</w:t>
       </w:r>
     </w:p>
     <w:p>
@@ -8116,39 +7714,15 @@
         <w:ind w:left="1440"/>
       </w:pPr>
       <w:r>
-        <w:t xml:space="preserve">const </w:t>
-      </w:r>
-      <w:proofErr w:type="spellStart"/>
-      <w:r>
-        <w:t>preSizedArray</w:t>
-      </w:r>
-      <w:proofErr w:type="spellEnd"/>
-      <w:r>
-        <w:t xml:space="preserve"> = new </w:t>
-      </w:r>
-      <w:proofErr w:type="gramStart"/>
-      <w:r>
-        <w:t>Array(</w:t>
-      </w:r>
-      <w:proofErr w:type="gramEnd"/>
-      <w:r>
-        <w:t>5); // Creates an array of length 5 with undefined slots</w:t>
-      </w:r>
-    </w:p>
-    <w:p>
-      <w:pPr>
-        <w:pStyle w:val="NoSpacing"/>
-      </w:pPr>
-      <w:r>
-        <w:t xml:space="preserve">It is a best practice to use Array Literal Notation ([]) because it is shorter, more readable, and faster to execute. Additionally, the constructor has a confusing behavior: passing a single number like new </w:t>
-      </w:r>
-      <w:proofErr w:type="gramStart"/>
-      <w:r>
-        <w:t>Array(</w:t>
-      </w:r>
-      <w:proofErr w:type="gramEnd"/>
-      <w:r>
-        <w:t>5) creates an array with 5 empty slots, whereas [5] creates an array containing only the number 5.</w:t>
+        <w:t>const preSizedArray = new Array(5); // Creates an array of length 5 with undefined slots</w:t>
+      </w:r>
+    </w:p>
+    <w:p>
+      <w:pPr>
+        <w:pStyle w:val="NoSpacing"/>
+      </w:pPr>
+      <w:r>
+        <w:t>It is a best practice to use Array Literal Notation ([]) because it is shorter, more readable, and faster to execute. Additionally, the constructor has a confusing behavior: passing a single number like new Array(5) creates an array with 5 empty slots, whereas [5] creates an array containing only the number 5.</w:t>
       </w:r>
     </w:p>
     <w:p>
@@ -8166,39 +7740,7 @@
         <w:pStyle w:val="Heading3"/>
       </w:pPr>
       <w:r>
-        <w:t xml:space="preserve">Question 2: Explain the methods </w:t>
-      </w:r>
-      <w:proofErr w:type="gramStart"/>
-      <w:r>
-        <w:t>push(</w:t>
-      </w:r>
-      <w:proofErr w:type="gramEnd"/>
-      <w:r>
-        <w:t xml:space="preserve">), </w:t>
-      </w:r>
-      <w:proofErr w:type="gramStart"/>
-      <w:r>
-        <w:t>pop(</w:t>
-      </w:r>
-      <w:proofErr w:type="gramEnd"/>
-      <w:r>
-        <w:t xml:space="preserve">), </w:t>
-      </w:r>
-      <w:proofErr w:type="gramStart"/>
-      <w:r>
-        <w:t>shift(</w:t>
-      </w:r>
-      <w:proofErr w:type="gramEnd"/>
-      <w:r>
-        <w:t xml:space="preserve">), and </w:t>
-      </w:r>
-      <w:proofErr w:type="gramStart"/>
-      <w:r>
-        <w:t>unshift(</w:t>
-      </w:r>
-      <w:proofErr w:type="gramEnd"/>
-      <w:r>
-        <w:t>) used in arrays.</w:t>
+        <w:t>Question 2: Explain the methods push(), pop(), shift(), and unshift() used in arrays.</w:t>
       </w:r>
     </w:p>
     <w:p/>
@@ -8207,39 +7749,7 @@
         <w:pStyle w:val="NoSpacing"/>
       </w:pPr>
       <w:r>
-        <w:t xml:space="preserve">In JavaScript, </w:t>
-      </w:r>
-      <w:proofErr w:type="gramStart"/>
-      <w:r>
-        <w:t>push(</w:t>
-      </w:r>
-      <w:proofErr w:type="gramEnd"/>
-      <w:r>
-        <w:t xml:space="preserve">), </w:t>
-      </w:r>
-      <w:proofErr w:type="gramStart"/>
-      <w:r>
-        <w:t>pop(</w:t>
-      </w:r>
-      <w:proofErr w:type="gramEnd"/>
-      <w:r>
-        <w:t xml:space="preserve">), </w:t>
-      </w:r>
-      <w:proofErr w:type="gramStart"/>
-      <w:r>
-        <w:t>shift(</w:t>
-      </w:r>
-      <w:proofErr w:type="gramEnd"/>
-      <w:r>
-        <w:t xml:space="preserve">), and </w:t>
-      </w:r>
-      <w:proofErr w:type="gramStart"/>
-      <w:r>
-        <w:t>unshift(</w:t>
-      </w:r>
-      <w:proofErr w:type="gramEnd"/>
-      <w:r>
-        <w:t xml:space="preserve">) are fundamental methods for adding or removing elements from an array. All four are mutating methods, meaning they directly modify the original array rather than creating a new one. </w:t>
+        <w:t xml:space="preserve">In JavaScript, push(), pop(), shift(), and unshift() are fundamental methods for adding or removing elements from an array. All four are mutating methods, meaning they directly modify the original array rather than creating a new one. </w:t>
       </w:r>
     </w:p>
     <w:p>
@@ -8277,7 +7787,6 @@
         <w:lastRenderedPageBreak/>
         <w:t>These methods are highly efficient (</w:t>
       </w:r>
-      <w:proofErr w:type="gramStart"/>
       <w:r>
         <w:rPr>
           <w:rFonts w:ascii="Cambria Math" w:hAnsi="Cambria Math" w:cs="Cambria Math"/>
@@ -8288,14 +7797,7 @@
         <w:rPr>
           <w:vertAlign w:val="subscript"/>
         </w:rPr>
-        <w:t>(</w:t>
-      </w:r>
-      <w:proofErr w:type="gramEnd"/>
-      <w:r>
-        <w:rPr>
-          <w:vertAlign w:val="subscript"/>
-        </w:rPr>
-        <w:t>1)</w:t>
+        <w:t>(1)</w:t>
       </w:r>
       <w:r>
         <w:t xml:space="preserve"> time complexity) because they don't require re-indexing the existing elements. </w:t>
@@ -8305,24 +7807,30 @@
       <w:pPr>
         <w:pStyle w:val="NoSpacing"/>
       </w:pPr>
-      <w:proofErr w:type="gramStart"/>
       <w:r>
         <w:rPr>
           <w:b/>
           <w:bCs/>
         </w:rPr>
-        <w:t>push(</w:t>
-      </w:r>
-      <w:proofErr w:type="gramEnd"/>
+        <w:t>push():</w:t>
+      </w:r>
+      <w:r>
+        <w:t xml:space="preserve"> Adds one or more elements to the end of the array.</w:t>
+      </w:r>
+    </w:p>
+    <w:p>
+      <w:pPr>
+        <w:pStyle w:val="NoSpacing"/>
+      </w:pPr>
       <w:r>
         <w:rPr>
           <w:b/>
           <w:bCs/>
         </w:rPr>
-        <w:t>):</w:t>
-      </w:r>
-      <w:r>
-        <w:t xml:space="preserve"> Adds one or more elements to the end of the array.</w:t>
+        <w:t>Returns:</w:t>
+      </w:r>
+      <w:r>
+        <w:t xml:space="preserve"> The new length of the array.</w:t>
       </w:r>
     </w:p>
     <w:p>
@@ -8334,152 +7842,110 @@
           <w:b/>
           <w:bCs/>
         </w:rPr>
-        <w:t>Returns:</w:t>
-      </w:r>
-      <w:r>
-        <w:t xml:space="preserve"> The new length of the array.</w:t>
-      </w:r>
-    </w:p>
-    <w:p>
-      <w:pPr>
-        <w:pStyle w:val="NoSpacing"/>
-      </w:pPr>
-      <w:proofErr w:type="gramStart"/>
+        <w:t>pop():</w:t>
+      </w:r>
+      <w:r>
+        <w:t xml:space="preserve"> Removes the last element from the array.</w:t>
+      </w:r>
+    </w:p>
+    <w:p>
+      <w:pPr>
+        <w:pStyle w:val="NoSpacing"/>
+      </w:pPr>
       <w:r>
         <w:rPr>
           <w:b/>
           <w:bCs/>
         </w:rPr>
-        <w:t>pop(</w:t>
-      </w:r>
-      <w:proofErr w:type="gramEnd"/>
-      <w:r>
+        <w:t>Returns:</w:t>
+      </w:r>
+      <w:r>
+        <w:t xml:space="preserve"> The removed element (or undefined if the array was empty). </w:t>
+      </w:r>
+    </w:p>
+    <w:p>
+      <w:pPr>
+        <w:pStyle w:val="NoSpacing"/>
+        <w:ind w:firstLine="0"/>
         <w:rPr>
           <w:b/>
           <w:bCs/>
         </w:rPr>
-        <w:t>):</w:t>
-      </w:r>
-      <w:r>
-        <w:t xml:space="preserve"> Removes the last element from the array.</w:t>
-      </w:r>
-    </w:p>
-    <w:p>
-      <w:pPr>
-        <w:pStyle w:val="NoSpacing"/>
       </w:pPr>
       <w:r>
         <w:rPr>
           <w:b/>
           <w:bCs/>
         </w:rPr>
-        <w:t>Returns:</w:t>
-      </w:r>
-      <w:r>
-        <w:t xml:space="preserve"> The removed element (or undefined if the array was empty). </w:t>
-      </w:r>
-    </w:p>
-    <w:p>
-      <w:pPr>
-        <w:pStyle w:val="NoSpacing"/>
-        <w:ind w:firstLine="0"/>
+        <w:t>Adding and Removing from the Beginning</w:t>
+      </w:r>
+    </w:p>
+    <w:p>
+      <w:pPr>
+        <w:pStyle w:val="NoSpacing"/>
+      </w:pPr>
+      <w:r>
+        <w:t>These methods are generally slower (</w:t>
+      </w:r>
+      <w:r>
+        <w:rPr>
+          <w:rFonts w:ascii="Cambria Math" w:hAnsi="Cambria Math" w:cs="Cambria Math"/>
+        </w:rPr>
+        <w:t>𝑂</w:t>
+      </w:r>
+      <w:r>
+        <w:t>(</w:t>
+      </w:r>
+      <w:r>
+        <w:rPr>
+          <w:rFonts w:ascii="Cambria Math" w:hAnsi="Cambria Math" w:cs="Cambria Math"/>
+        </w:rPr>
+        <w:t>𝑛</w:t>
+      </w:r>
+      <w:r>
+        <w:t xml:space="preserve">) time complexity) for large arrays because they force every remaining element to be moved to a new index. </w:t>
+      </w:r>
+    </w:p>
+    <w:p>
+      <w:pPr>
+        <w:pStyle w:val="NoSpacing"/>
+      </w:pPr>
+      <w:r>
         <w:rPr>
           <w:b/>
           <w:bCs/>
         </w:rPr>
+        <w:t>unshift():</w:t>
+      </w:r>
+      <w:r>
+        <w:t xml:space="preserve"> Adds one or more elements to the beginning of the array.</w:t>
+      </w:r>
+    </w:p>
+    <w:p>
+      <w:pPr>
+        <w:pStyle w:val="NoSpacing"/>
       </w:pPr>
       <w:r>
         <w:rPr>
           <w:b/>
           <w:bCs/>
         </w:rPr>
-        <w:t>Adding and Removing from the Beginning</w:t>
-      </w:r>
-    </w:p>
-    <w:p>
-      <w:pPr>
-        <w:pStyle w:val="NoSpacing"/>
-      </w:pPr>
-      <w:r>
-        <w:t>These methods are generally slower (</w:t>
-      </w:r>
-      <w:r>
-        <w:rPr>
-          <w:rFonts w:ascii="Cambria Math" w:hAnsi="Cambria Math" w:cs="Cambria Math"/>
-        </w:rPr>
-        <w:t>𝑂</w:t>
-      </w:r>
-      <w:r>
-        <w:t>(</w:t>
-      </w:r>
-      <w:r>
-        <w:rPr>
-          <w:rFonts w:ascii="Cambria Math" w:hAnsi="Cambria Math" w:cs="Cambria Math"/>
-        </w:rPr>
-        <w:t>𝑛</w:t>
-      </w:r>
-      <w:r>
-        <w:t xml:space="preserve">) time complexity) for large arrays because they force every remaining element to be moved to a new index. </w:t>
-      </w:r>
-    </w:p>
-    <w:p>
-      <w:pPr>
-        <w:pStyle w:val="NoSpacing"/>
-      </w:pPr>
-      <w:proofErr w:type="gramStart"/>
+        <w:t>Returns:</w:t>
+      </w:r>
+      <w:r>
+        <w:t xml:space="preserve"> The new length of the array.</w:t>
+      </w:r>
+    </w:p>
+    <w:p>
+      <w:pPr>
+        <w:pStyle w:val="NoSpacing"/>
+      </w:pPr>
       <w:r>
         <w:rPr>
           <w:b/>
           <w:bCs/>
         </w:rPr>
-        <w:t>unshift(</w:t>
-      </w:r>
-      <w:proofErr w:type="gramEnd"/>
-      <w:r>
-        <w:rPr>
-          <w:b/>
-          <w:bCs/>
-        </w:rPr>
-        <w:t>):</w:t>
-      </w:r>
-      <w:r>
-        <w:t xml:space="preserve"> Adds one or more elements to the beginning of the array.</w:t>
-      </w:r>
-    </w:p>
-    <w:p>
-      <w:pPr>
-        <w:pStyle w:val="NoSpacing"/>
-      </w:pPr>
-      <w:r>
-        <w:rPr>
-          <w:b/>
-          <w:bCs/>
-        </w:rPr>
-        <w:t>Returns:</w:t>
-      </w:r>
-      <w:r>
-        <w:t xml:space="preserve"> The new length of the array.</w:t>
-      </w:r>
-    </w:p>
-    <w:p>
-      <w:pPr>
-        <w:pStyle w:val="NoSpacing"/>
-      </w:pPr>
-      <w:proofErr w:type="gramStart"/>
-      <w:r>
-        <w:rPr>
-          <w:b/>
-          <w:bCs/>
-        </w:rPr>
-        <w:t>shift(</w:t>
-      </w:r>
-      <w:proofErr w:type="gramEnd"/>
-      <w:r>
-        <w:rPr>
-          <w:b/>
-          <w:bCs/>
-        </w:rPr>
-        <w:t>):</w:t>
+        <w:t>shift():</w:t>
       </w:r>
       <w:r>
         <w:t xml:space="preserve"> Removes the first element from the array.</w:t>
@@ -8694,21 +8160,12 @@
                 <w:szCs w:val="20"/>
               </w:rPr>
             </w:pPr>
-            <w:proofErr w:type="gramStart"/>
             <w:r>
               <w:rPr>
                 <w:sz w:val="22"/>
                 <w:szCs w:val="20"/>
               </w:rPr>
-              <w:t>push(</w:t>
-            </w:r>
-            <w:proofErr w:type="gramEnd"/>
-            <w:r>
-              <w:rPr>
-                <w:sz w:val="22"/>
-                <w:szCs w:val="20"/>
-              </w:rPr>
-              <w:t>)</w:t>
+              <w:t>push()</w:t>
             </w:r>
           </w:p>
         </w:tc>
@@ -8798,7 +8255,6 @@
               </w:rPr>
               <w:t>Fast (</w:t>
             </w:r>
-            <w:proofErr w:type="gramStart"/>
             <w:r>
               <w:rPr>
                 <w:rFonts w:ascii="Cambria Math" w:hAnsi="Cambria Math" w:cs="Cambria Math"/>
@@ -8812,15 +8268,7 @@
                 <w:sz w:val="22"/>
                 <w:szCs w:val="20"/>
               </w:rPr>
-              <w:t>(</w:t>
-            </w:r>
-            <w:proofErr w:type="gramEnd"/>
-            <w:r>
-              <w:rPr>
-                <w:sz w:val="22"/>
-                <w:szCs w:val="20"/>
-              </w:rPr>
-              <w:t>1))</w:t>
+              <w:t>(1))</w:t>
             </w:r>
           </w:p>
         </w:tc>
@@ -8839,21 +8287,12 @@
                 <w:szCs w:val="20"/>
               </w:rPr>
             </w:pPr>
-            <w:proofErr w:type="gramStart"/>
             <w:r>
               <w:rPr>
                 <w:sz w:val="22"/>
                 <w:szCs w:val="20"/>
               </w:rPr>
-              <w:t>pop(</w:t>
-            </w:r>
-            <w:proofErr w:type="gramEnd"/>
-            <w:r>
-              <w:rPr>
-                <w:sz w:val="22"/>
-                <w:szCs w:val="20"/>
-              </w:rPr>
-              <w:t>)</w:t>
+              <w:t>pop()</w:t>
             </w:r>
             <w:r>
               <w:rPr>
@@ -8950,7 +8389,6 @@
               </w:rPr>
               <w:t>Fast (</w:t>
             </w:r>
-            <w:proofErr w:type="gramStart"/>
             <w:r>
               <w:rPr>
                 <w:rFonts w:ascii="Cambria Math" w:hAnsi="Cambria Math" w:cs="Cambria Math"/>
@@ -8964,15 +8402,7 @@
                 <w:sz w:val="22"/>
                 <w:szCs w:val="20"/>
               </w:rPr>
-              <w:t>(</w:t>
-            </w:r>
-            <w:proofErr w:type="gramEnd"/>
-            <w:r>
-              <w:rPr>
-                <w:sz w:val="22"/>
-                <w:szCs w:val="20"/>
-              </w:rPr>
-              <w:t>1))</w:t>
+              <w:t>(1))</w:t>
             </w:r>
           </w:p>
         </w:tc>
@@ -8991,21 +8421,12 @@
                 <w:szCs w:val="20"/>
               </w:rPr>
             </w:pPr>
-            <w:proofErr w:type="gramStart"/>
             <w:r>
               <w:rPr>
                 <w:sz w:val="22"/>
                 <w:szCs w:val="20"/>
               </w:rPr>
-              <w:t>unshift(</w:t>
-            </w:r>
-            <w:proofErr w:type="gramEnd"/>
-            <w:r>
-              <w:rPr>
-                <w:sz w:val="22"/>
-                <w:szCs w:val="20"/>
-              </w:rPr>
-              <w:t>)</w:t>
+              <w:t>unshift()</w:t>
             </w:r>
           </w:p>
         </w:tc>
@@ -9142,21 +8563,12 @@
                 <w:szCs w:val="20"/>
               </w:rPr>
             </w:pPr>
-            <w:proofErr w:type="gramStart"/>
             <w:r>
               <w:rPr>
                 <w:sz w:val="22"/>
                 <w:szCs w:val="20"/>
               </w:rPr>
-              <w:t>shift(</w:t>
-            </w:r>
-            <w:proofErr w:type="gramEnd"/>
-            <w:r>
-              <w:rPr>
-                <w:sz w:val="22"/>
-                <w:szCs w:val="20"/>
-              </w:rPr>
-              <w:t>)</w:t>
+              <w:t>shift()</w:t>
             </w:r>
           </w:p>
         </w:tc>
@@ -9673,25 +9085,7 @@
                 <w:sz w:val="22"/>
                 <w:szCs w:val="20"/>
               </w:rPr>
-              <w:t> </w:t>
-            </w:r>
-            <w:proofErr w:type="gramStart"/>
-            <w:r>
-              <w:rPr>
-                <w:rFonts w:eastAsiaTheme="majorEastAsia"/>
-                <w:sz w:val="22"/>
-                <w:szCs w:val="20"/>
-              </w:rPr>
-              <w:t>list[</w:t>
-            </w:r>
-            <w:proofErr w:type="gramEnd"/>
-            <w:r>
-              <w:rPr>
-                <w:rFonts w:eastAsiaTheme="majorEastAsia"/>
-                <w:sz w:val="22"/>
-                <w:szCs w:val="20"/>
-              </w:rPr>
-              <w:t>0]</w:t>
+              <w:t> list[0]</w:t>
             </w:r>
             <w:r>
               <w:rPr>
@@ -9751,7 +9145,6 @@
               </w:rPr>
               <w:t>Dot notation (</w:t>
             </w:r>
-            <w:proofErr w:type="spellStart"/>
             <w:r>
               <w:rPr>
                 <w:rFonts w:eastAsiaTheme="majorEastAsia"/>
@@ -9760,7 +9153,6 @@
               </w:rPr>
               <w:t>obj.key</w:t>
             </w:r>
-            <w:proofErr w:type="spellEnd"/>
             <w:r>
               <w:rPr>
                 <w:sz w:val="22"/>
@@ -9807,33 +9199,13 @@
               </w:rPr>
               <w:t>Bracket notation with numeric index (</w:t>
             </w:r>
-            <w:proofErr w:type="spellStart"/>
-            <w:proofErr w:type="gramStart"/>
             <w:r>
               <w:rPr>
                 <w:rFonts w:eastAsiaTheme="majorEastAsia"/>
                 <w:sz w:val="22"/>
                 <w:szCs w:val="20"/>
               </w:rPr>
-              <w:t>arr</w:t>
-            </w:r>
-            <w:proofErr w:type="spellEnd"/>
-            <w:r>
-              <w:rPr>
-                <w:rFonts w:eastAsiaTheme="majorEastAsia"/>
-                <w:sz w:val="22"/>
-                <w:szCs w:val="20"/>
-              </w:rPr>
-              <w:t>[</w:t>
-            </w:r>
-            <w:proofErr w:type="gramEnd"/>
-            <w:r>
-              <w:rPr>
-                <w:rFonts w:eastAsiaTheme="majorEastAsia"/>
-                <w:sz w:val="22"/>
-                <w:szCs w:val="20"/>
-              </w:rPr>
-              <w:t>0]</w:t>
+              <w:t>arr[0]</w:t>
             </w:r>
             <w:r>
               <w:rPr>
@@ -9899,16 +9271,7 @@
                 <w:sz w:val="22"/>
                 <w:szCs w:val="20"/>
               </w:rPr>
-              <w:t> </w:t>
-            </w:r>
-            <w:proofErr w:type="spellStart"/>
-            <w:r>
-              <w:rPr>
-                <w:rFonts w:eastAsiaTheme="majorEastAsia"/>
-                <w:sz w:val="22"/>
-                <w:szCs w:val="20"/>
-              </w:rPr>
-              <w:t>length</w:t>
+              <w:t> length</w:t>
             </w:r>
             <w:r>
               <w:rPr>
@@ -9917,7 +9280,6 @@
               </w:rPr>
               <w:t>property</w:t>
             </w:r>
-            <w:proofErr w:type="spellEnd"/>
           </w:p>
         </w:tc>
         <w:tc>
@@ -9948,16 +9310,7 @@
                 <w:sz w:val="22"/>
                 <w:szCs w:val="20"/>
               </w:rPr>
-              <w:t> </w:t>
-            </w:r>
-            <w:proofErr w:type="spellStart"/>
-            <w:r>
-              <w:rPr>
-                <w:rFonts w:eastAsiaTheme="majorEastAsia"/>
-                <w:sz w:val="22"/>
-                <w:szCs w:val="20"/>
-              </w:rPr>
-              <w:t>length</w:t>
+              <w:t> length</w:t>
             </w:r>
             <w:r>
               <w:rPr>
@@ -9966,7 +9319,6 @@
               </w:rPr>
               <w:t>property</w:t>
             </w:r>
-            <w:proofErr w:type="spellEnd"/>
           </w:p>
         </w:tc>
       </w:tr>
@@ -10024,18 +9376,8 @@
                 <w:sz w:val="22"/>
                 <w:szCs w:val="20"/>
               </w:rPr>
-              <w:t> </w:t>
+              <w:t> { }</w:t>
             </w:r>
-            <w:proofErr w:type="gramStart"/>
-            <w:r>
-              <w:rPr>
-                <w:rFonts w:eastAsiaTheme="majorEastAsia"/>
-                <w:sz w:val="22"/>
-                <w:szCs w:val="20"/>
-              </w:rPr>
-              <w:t>{ }</w:t>
-            </w:r>
-            <w:proofErr w:type="gramEnd"/>
           </w:p>
         </w:tc>
         <w:tc>
@@ -10066,18 +9408,8 @@
                 <w:sz w:val="22"/>
                 <w:szCs w:val="20"/>
               </w:rPr>
-              <w:t> </w:t>
+              <w:t> [ ]</w:t>
             </w:r>
-            <w:proofErr w:type="gramStart"/>
-            <w:r>
-              <w:rPr>
-                <w:rFonts w:eastAsiaTheme="majorEastAsia"/>
-                <w:sz w:val="22"/>
-                <w:szCs w:val="20"/>
-              </w:rPr>
-              <w:t>[ ]</w:t>
-            </w:r>
-            <w:proofErr w:type="gramEnd"/>
           </w:p>
         </w:tc>
       </w:tr>
@@ -10143,25 +9475,7 @@
                 <w:sz w:val="22"/>
                 <w:szCs w:val="20"/>
               </w:rPr>
-              <w:t> </w:t>
-            </w:r>
-            <w:proofErr w:type="spellStart"/>
-            <w:r>
-              <w:rPr>
-                <w:rFonts w:eastAsiaTheme="majorEastAsia"/>
-                <w:sz w:val="22"/>
-                <w:szCs w:val="20"/>
-              </w:rPr>
-              <w:t>Object.keys</w:t>
-            </w:r>
-            <w:proofErr w:type="spellEnd"/>
-            <w:r>
-              <w:rPr>
-                <w:rFonts w:eastAsiaTheme="majorEastAsia"/>
-                <w:sz w:val="22"/>
-                <w:szCs w:val="20"/>
-              </w:rPr>
-              <w:t>()</w:t>
+              <w:t> Object.keys()</w:t>
             </w:r>
           </w:p>
         </w:tc>
@@ -10216,35 +9530,7 @@
                 <w:sz w:val="22"/>
                 <w:szCs w:val="20"/>
               </w:rPr>
-              <w:t> </w:t>
-            </w:r>
-            <w:proofErr w:type="spellStart"/>
-            <w:proofErr w:type="gramStart"/>
-            <w:r>
-              <w:rPr>
-                <w:rFonts w:eastAsiaTheme="majorEastAsia"/>
-                <w:sz w:val="22"/>
-                <w:szCs w:val="20"/>
-              </w:rPr>
-              <w:t>forEach</w:t>
-            </w:r>
-            <w:proofErr w:type="spellEnd"/>
-            <w:r>
-              <w:rPr>
-                <w:rFonts w:eastAsiaTheme="majorEastAsia"/>
-                <w:sz w:val="22"/>
-                <w:szCs w:val="20"/>
-              </w:rPr>
-              <w:t>(</w:t>
-            </w:r>
-            <w:proofErr w:type="gramEnd"/>
-            <w:r>
-              <w:rPr>
-                <w:rFonts w:eastAsiaTheme="majorEastAsia"/>
-                <w:sz w:val="22"/>
-                <w:szCs w:val="20"/>
-              </w:rPr>
-              <w:t>)</w:t>
+              <w:t> forEach()</w:t>
             </w:r>
           </w:p>
         </w:tc>
@@ -10409,18 +9695,8 @@
         <w:rPr>
           <w:rFonts w:eastAsiaTheme="majorEastAsia"/>
         </w:rPr>
-        <w:t> </w:t>
-      </w:r>
-      <w:proofErr w:type="spellStart"/>
-      <w:proofErr w:type="gramStart"/>
-      <w:r>
-        <w:rPr>
-          <w:rFonts w:eastAsiaTheme="majorEastAsia"/>
-        </w:rPr>
-        <w:t>object.property</w:t>
-      </w:r>
-      <w:proofErr w:type="spellEnd"/>
-      <w:proofErr w:type="gramEnd"/>
+        <w:t> object.property</w:t>
+      </w:r>
     </w:p>
     <w:p>
       <w:pPr>
@@ -10438,32 +9714,8 @@
         <w:rPr>
           <w:rFonts w:eastAsiaTheme="majorEastAsia"/>
         </w:rPr>
-        <w:t> </w:t>
-      </w:r>
-      <w:proofErr w:type="spellStart"/>
-      <w:proofErr w:type="gramStart"/>
-      <w:r>
-        <w:rPr>
-          <w:rFonts w:eastAsiaTheme="majorEastAsia"/>
-        </w:rPr>
-        <w:t>object.property</w:t>
-      </w:r>
-      <w:proofErr w:type="spellEnd"/>
-      <w:proofErr w:type="gramEnd"/>
-      <w:r>
-        <w:rPr>
-          <w:rFonts w:eastAsiaTheme="majorEastAsia"/>
-        </w:rPr>
-        <w:t xml:space="preserve"> = </w:t>
-      </w:r>
-      <w:proofErr w:type="spellStart"/>
-      <w:r>
-        <w:rPr>
-          <w:rFonts w:eastAsiaTheme="majorEastAsia"/>
-        </w:rPr>
-        <w:t>newValue</w:t>
-      </w:r>
-      <w:proofErr w:type="spellEnd"/>
+        <w:t> object.property = newValue</w:t>
+      </w:r>
     </w:p>
     <w:p>
       <w:pPr>
@@ -10504,23 +9756,7 @@
         <w:ind w:left="720"/>
       </w:pPr>
       <w:r>
-        <w:t xml:space="preserve">const user = </w:t>
-      </w:r>
-      <w:proofErr w:type="gramStart"/>
-      <w:r>
-        <w:t>{ name</w:t>
-      </w:r>
-      <w:proofErr w:type="gramEnd"/>
-      <w:r>
-        <w:t xml:space="preserve">: "Alice", age: </w:t>
-      </w:r>
-      <w:proofErr w:type="gramStart"/>
-      <w:r>
-        <w:t>25 }</w:t>
-      </w:r>
-      <w:proofErr w:type="gramEnd"/>
-      <w:r>
-        <w:t>;</w:t>
+        <w:t>const user = { name: "Alice", age: 25 };</w:t>
       </w:r>
     </w:p>
     <w:p>
@@ -10556,13 +9792,8 @@
         <w:pStyle w:val="NoSpacing"/>
         <w:ind w:left="1440"/>
       </w:pPr>
-      <w:proofErr w:type="spellStart"/>
-      <w:r>
-        <w:t>user.age</w:t>
-      </w:r>
-      <w:proofErr w:type="spellEnd"/>
-      <w:r>
-        <w:t xml:space="preserve"> = 26; </w:t>
+      <w:r>
+        <w:t xml:space="preserve">user.age = 26; </w:t>
       </w:r>
     </w:p>
     <w:p>
@@ -10571,20 +9802,7 @@
         <w:ind w:left="1440"/>
       </w:pPr>
       <w:r>
-        <w:t>console.log(</w:t>
-      </w:r>
-      <w:proofErr w:type="spellStart"/>
-      <w:r>
-        <w:t>user.age</w:t>
-      </w:r>
-      <w:proofErr w:type="spellEnd"/>
-      <w:proofErr w:type="gramStart"/>
-      <w:r>
-        <w:t>);  /</w:t>
-      </w:r>
-      <w:proofErr w:type="gramEnd"/>
-      <w:r>
-        <w:t>/ 26</w:t>
+        <w:t>console.log(user.age);  // 26</w:t>
       </w:r>
     </w:p>
     <w:p>
@@ -10662,16 +9880,8 @@
         <w:rPr>
           <w:rFonts w:eastAsiaTheme="majorEastAsia"/>
         </w:rPr>
-        <w:t xml:space="preserve"> object["property"] = </w:t>
-      </w:r>
-      <w:proofErr w:type="spellStart"/>
-      <w:r>
-        <w:rPr>
-          <w:rFonts w:eastAsiaTheme="majorEastAsia"/>
-        </w:rPr>
-        <w:t>newValue</w:t>
-      </w:r>
-      <w:proofErr w:type="spellEnd"/>
+        <w:t> object["property"] = newValue</w:t>
+      </w:r>
     </w:p>
     <w:p>
       <w:pPr>
@@ -10715,23 +9925,7 @@
         <w:ind w:left="720"/>
       </w:pPr>
       <w:r>
-        <w:t xml:space="preserve">const car = </w:t>
-      </w:r>
-      <w:proofErr w:type="gramStart"/>
-      <w:r>
-        <w:t>{ "</w:t>
-      </w:r>
-      <w:proofErr w:type="gramEnd"/>
-      <w:r>
-        <w:t xml:space="preserve">brand-name": "Toyota", year: </w:t>
-      </w:r>
-      <w:proofErr w:type="gramStart"/>
-      <w:r>
-        <w:t>2020 }</w:t>
-      </w:r>
-      <w:proofErr w:type="gramEnd"/>
-      <w:r>
-        <w:t>;</w:t>
+        <w:t>const car = { "brand-name": "Toyota", year: 2020 };</w:t>
       </w:r>
     </w:p>
     <w:p>
@@ -11229,21 +10423,7 @@
         <w:rPr>
           <w:rFonts w:eastAsiaTheme="majorEastAsia"/>
         </w:rPr>
-        <w:t> For keys that include spaces or start with numbers (e.g., </w:t>
-      </w:r>
-      <w:proofErr w:type="gramStart"/>
-      <w:r>
-        <w:rPr>
-          <w:rFonts w:eastAsiaTheme="majorEastAsia"/>
-        </w:rPr>
-        <w:t>obj[</w:t>
-      </w:r>
-      <w:proofErr w:type="gramEnd"/>
-      <w:r>
-        <w:rPr>
-          <w:rFonts w:eastAsiaTheme="majorEastAsia"/>
-        </w:rPr>
-        <w:t>"2nd place"]).</w:t>
+        <w:t> For keys that include spaces or start with numbers (e.g., obj["2nd place"]).</w:t>
       </w:r>
     </w:p>
     <w:p>
@@ -11418,16 +10598,8 @@
         <w:rPr>
           <w:rFonts w:eastAsiaTheme="majorEastAsia"/>
         </w:rPr>
-        <w:t> </w:t>
-      </w:r>
-      <w:proofErr w:type="spellStart"/>
-      <w:r>
-        <w:rPr>
-          <w:rFonts w:eastAsiaTheme="majorEastAsia"/>
-        </w:rPr>
-        <w:t>dblclick</w:t>
-      </w:r>
-      <w:proofErr w:type="spellEnd"/>
+        <w:t> dblclick</w:t>
+      </w:r>
       <w:r>
         <w:t>.</w:t>
       </w:r>
@@ -11459,44 +10631,16 @@
         <w:rPr>
           <w:rFonts w:eastAsiaTheme="majorEastAsia"/>
         </w:rPr>
-        <w:t> </w:t>
-      </w:r>
-      <w:proofErr w:type="spellStart"/>
+        <w:t> keydown </w:t>
+      </w:r>
+      <w:r>
+        <w:t>(pressing a key),</w:t>
+      </w:r>
       <w:r>
         <w:rPr>
           <w:rFonts w:eastAsiaTheme="majorEastAsia"/>
         </w:rPr>
-        <w:t>keydown</w:t>
-      </w:r>
-      <w:proofErr w:type="spellEnd"/>
-      <w:r>
-        <w:rPr>
-          <w:rFonts w:eastAsiaTheme="majorEastAsia"/>
-        </w:rPr>
-        <w:t> </w:t>
-      </w:r>
-      <w:r>
-        <w:t>(pressing a key),</w:t>
-      </w:r>
-      <w:r>
-        <w:rPr>
-          <w:rFonts w:eastAsiaTheme="majorEastAsia"/>
-        </w:rPr>
-        <w:t> </w:t>
-      </w:r>
-      <w:proofErr w:type="spellStart"/>
-      <w:r>
-        <w:rPr>
-          <w:rFonts w:eastAsiaTheme="majorEastAsia"/>
-        </w:rPr>
-        <w:t>keyup</w:t>
-      </w:r>
-      <w:proofErr w:type="spellEnd"/>
-      <w:r>
-        <w:rPr>
-          <w:rFonts w:eastAsiaTheme="majorEastAsia"/>
-        </w:rPr>
-        <w:t> </w:t>
+        <w:t> keyup </w:t>
       </w:r>
       <w:r>
         <w:t>(releasing it).</w:t>
@@ -11740,36 +10884,16 @@
         </w:rPr>
         <w:t> </w:t>
       </w:r>
-      <w:proofErr w:type="spellStart"/>
-      <w:r>
-        <w:fldChar w:fldCharType="begin"/>
-      </w:r>
-      <w:r>
-        <w:instrText>HYPERLINK "https://developer.mozilla.org/en-US/docs/Web/API/EventTarget/addEventListener" \t "_blank"</w:instrText>
-      </w:r>
-      <w:r>
-        <w:fldChar w:fldCharType="separate"/>
-      </w:r>
-      <w:r>
-        <w:rPr>
-          <w:rStyle w:val="Hyperlink"/>
-          <w:color w:val="000000" w:themeColor="text1"/>
-          <w:u w:val="none"/>
-        </w:rPr>
-        <w:t>addEventListener</w:t>
-      </w:r>
-      <w:proofErr w:type="spellEnd"/>
-      <w:r>
-        <w:rPr>
-          <w:rStyle w:val="Hyperlink"/>
-          <w:color w:val="000000" w:themeColor="text1"/>
-          <w:u w:val="none"/>
-        </w:rPr>
-        <w:t>() method</w:t>
-      </w:r>
-      <w:r>
-        <w:fldChar w:fldCharType="end"/>
-      </w:r>
+      <w:hyperlink r:id="rId9" w:tgtFrame="_blank" w:history="1">
+        <w:r>
+          <w:rPr>
+            <w:rStyle w:val="Hyperlink"/>
+            <w:color w:val="000000" w:themeColor="text1"/>
+            <w:u w:val="none"/>
+          </w:rPr>
+          <w:t>addEventListener() method</w:t>
+        </w:r>
+      </w:hyperlink>
       <w:r>
         <w:rPr>
           <w:rFonts w:eastAsiaTheme="majorEastAsia"/>
@@ -11884,25 +11008,7 @@
         <w:ind w:left="720"/>
       </w:pPr>
       <w:r>
-        <w:t xml:space="preserve">const </w:t>
-      </w:r>
-      <w:proofErr w:type="spellStart"/>
-      <w:r>
-        <w:t>btn</w:t>
-      </w:r>
-      <w:proofErr w:type="spellEnd"/>
-      <w:r>
-        <w:t xml:space="preserve"> = </w:t>
-      </w:r>
-      <w:proofErr w:type="spellStart"/>
-      <w:proofErr w:type="gramStart"/>
-      <w:r>
-        <w:t>document.querySelector</w:t>
-      </w:r>
-      <w:proofErr w:type="spellEnd"/>
-      <w:proofErr w:type="gramEnd"/>
-      <w:r>
-        <w:t>('button');</w:t>
+        <w:t>const btn = document.querySelector('button');</w:t>
       </w:r>
     </w:p>
     <w:p>
@@ -11919,23 +11025,8 @@
         <w:pStyle w:val="NoSpacing"/>
         <w:ind w:left="1440"/>
       </w:pPr>
-      <w:proofErr w:type="spellStart"/>
-      <w:proofErr w:type="gramStart"/>
-      <w:r>
-        <w:t>btn.addEventListener</w:t>
-      </w:r>
-      <w:proofErr w:type="spellEnd"/>
-      <w:proofErr w:type="gramEnd"/>
-      <w:r>
-        <w:t xml:space="preserve">('click', </w:t>
-      </w:r>
-      <w:proofErr w:type="gramStart"/>
-      <w:r>
-        <w:t>function(</w:t>
-      </w:r>
-      <w:proofErr w:type="gramEnd"/>
-      <w:r>
-        <w:t>) {</w:t>
+      <w:r>
+        <w:t>btn.addEventListener('click', function() {</w:t>
       </w:r>
     </w:p>
     <w:p>
@@ -11944,15 +11035,7 @@
         <w:ind w:left="1440"/>
       </w:pPr>
       <w:r>
-        <w:t xml:space="preserve">    </w:t>
-      </w:r>
-      <w:proofErr w:type="gramStart"/>
-      <w:r>
-        <w:t>alert(</w:t>
-      </w:r>
-      <w:proofErr w:type="gramEnd"/>
-      <w:r>
-        <w:t>'Button was clicked!');</w:t>
+        <w:t xml:space="preserve">    alert('Button was clicked!');</w:t>
       </w:r>
     </w:p>
     <w:p>
@@ -12000,20 +11083,7 @@
       </w:pPr>
       <w:r>
         <w:lastRenderedPageBreak/>
-        <w:t xml:space="preserve">Question 2: How does the </w:t>
-      </w:r>
-      <w:proofErr w:type="spellStart"/>
-      <w:proofErr w:type="gramStart"/>
-      <w:r>
-        <w:t>addEventListener</w:t>
-      </w:r>
-      <w:proofErr w:type="spellEnd"/>
-      <w:r>
-        <w:t>(</w:t>
-      </w:r>
-      <w:proofErr w:type="gramEnd"/>
-      <w:r>
-        <w:t>) method work in JavaScript? Provide an example.</w:t>
+        <w:t>Question 2: How does the addEventListener() method work in JavaScript? Provide an example.</w:t>
       </w:r>
     </w:p>
     <w:p/>
@@ -12028,29 +11098,7 @@
         <w:rPr>
           <w:rFonts w:eastAsiaTheme="majorEastAsia"/>
         </w:rPr>
-        <w:t> </w:t>
-      </w:r>
-      <w:proofErr w:type="spellStart"/>
-      <w:proofErr w:type="gramStart"/>
-      <w:r>
-        <w:rPr>
-          <w:rFonts w:eastAsiaTheme="majorEastAsia"/>
-        </w:rPr>
-        <w:t>addEventListener</w:t>
-      </w:r>
-      <w:proofErr w:type="spellEnd"/>
-      <w:r>
-        <w:rPr>
-          <w:rFonts w:eastAsiaTheme="majorEastAsia"/>
-        </w:rPr>
-        <w:t>(</w:t>
-      </w:r>
-      <w:proofErr w:type="gramEnd"/>
-      <w:r>
-        <w:rPr>
-          <w:rFonts w:eastAsiaTheme="majorEastAsia"/>
-        </w:rPr>
-        <w:t>) </w:t>
+        <w:t> addEventListener() </w:t>
       </w:r>
       <w:r>
         <w:t>method is a way to tell the browser to "listen" for a specific event—like a click, keypress, or mouse movement—on a particular element.</w:t>
@@ -12147,29 +11195,7 @@
         <w:rPr>
           <w:rFonts w:eastAsiaTheme="majorEastAsia"/>
         </w:rPr>
-        <w:t xml:space="preserve"> You call </w:t>
-      </w:r>
-      <w:proofErr w:type="spellStart"/>
-      <w:proofErr w:type="gramStart"/>
-      <w:r>
-        <w:rPr>
-          <w:rFonts w:eastAsiaTheme="majorEastAsia"/>
-        </w:rPr>
-        <w:t>addEventListener</w:t>
-      </w:r>
-      <w:proofErr w:type="spellEnd"/>
-      <w:r>
-        <w:rPr>
-          <w:rFonts w:eastAsiaTheme="majorEastAsia"/>
-        </w:rPr>
-        <w:t>(</w:t>
-      </w:r>
-      <w:proofErr w:type="gramEnd"/>
-      <w:r>
-        <w:rPr>
-          <w:rFonts w:eastAsiaTheme="majorEastAsia"/>
-        </w:rPr>
-        <w:t>)on that element.</w:t>
+        <w:t xml:space="preserve"> You call addEventListener()on that element.</w:t>
       </w:r>
     </w:p>
     <w:p>
@@ -12285,23 +11311,8 @@
       <w:pPr>
         <w:pStyle w:val="NoSpacing"/>
       </w:pPr>
-      <w:proofErr w:type="spellStart"/>
-      <w:proofErr w:type="gramStart"/>
-      <w:r>
-        <w:t>element.addEventListener</w:t>
-      </w:r>
-      <w:proofErr w:type="spellEnd"/>
-      <w:proofErr w:type="gramEnd"/>
-      <w:r>
-        <w:t xml:space="preserve">(event, function, </w:t>
-      </w:r>
-      <w:proofErr w:type="spellStart"/>
-      <w:r>
-        <w:t>useCapture</w:t>
-      </w:r>
-      <w:proofErr w:type="spellEnd"/>
-      <w:r>
-        <w:t>);</w:t>
+      <w:r>
+        <w:t>element.addEventListener(event, function, useCapture);</w:t>
       </w:r>
     </w:p>
     <w:p>
@@ -12324,21 +11335,7 @@
         <w:rPr>
           <w:rFonts w:eastAsiaTheme="majorEastAsia"/>
         </w:rPr>
-        <w:t xml:space="preserve"> (Required) Name of the event. Note: Do </w:t>
-      </w:r>
-      <w:proofErr w:type="spellStart"/>
-      <w:r>
-        <w:rPr>
-          <w:rFonts w:eastAsiaTheme="majorEastAsia"/>
-        </w:rPr>
-        <w:t>notuse</w:t>
-      </w:r>
-      <w:proofErr w:type="spellEnd"/>
-      <w:r>
-        <w:rPr>
-          <w:rFonts w:eastAsiaTheme="majorEastAsia"/>
-        </w:rPr>
-        <w:t xml:space="preserve"> the "on" prefix (use "click", not "onclick").</w:t>
+        <w:t xml:space="preserve"> (Required) Name of the event. Note: Do notuse the "on" prefix (use "click", not "onclick").</w:t>
       </w:r>
     </w:p>
     <w:p>
@@ -12372,59 +11369,35 @@
           <w:numId w:val="214"/>
         </w:numPr>
       </w:pPr>
-      <w:proofErr w:type="spellStart"/>
       <w:r>
         <w:rPr>
           <w:rFonts w:eastAsiaTheme="majorEastAsia"/>
           <w:b/>
           <w:bCs/>
         </w:rPr>
-        <w:t>useCapture</w:t>
-      </w:r>
-      <w:proofErr w:type="spellEnd"/>
+        <w:t>useCapture:</w:t>
+      </w:r>
       <w:r>
         <w:rPr>
           <w:rFonts w:eastAsiaTheme="majorEastAsia"/>
+        </w:rPr>
+        <w:t xml:space="preserve"> (Optional) A boolean (default false) that controls whether the event should be handled in the capturing or bubbling phase. </w:t>
+      </w:r>
+    </w:p>
+    <w:p>
+      <w:pPr>
+        <w:pStyle w:val="NoSpacing"/>
+        <w:ind w:firstLine="0"/>
+        <w:rPr>
           <w:b/>
           <w:bCs/>
         </w:rPr>
-        <w:t>:</w:t>
-      </w:r>
-      <w:r>
-        <w:rPr>
-          <w:rFonts w:eastAsiaTheme="majorEastAsia"/>
-        </w:rPr>
-        <w:t xml:space="preserve"> (Optional) A </w:t>
-      </w:r>
-      <w:proofErr w:type="spellStart"/>
-      <w:r>
-        <w:rPr>
-          <w:rFonts w:eastAsiaTheme="majorEastAsia"/>
-        </w:rPr>
-        <w:t>boolean</w:t>
-      </w:r>
-      <w:proofErr w:type="spellEnd"/>
-      <w:r>
-        <w:rPr>
-          <w:rFonts w:eastAsiaTheme="majorEastAsia"/>
-        </w:rPr>
-        <w:t xml:space="preserve"> (default false) that controls whether the event should be handled in the capturing or bubbling phase. </w:t>
-      </w:r>
-    </w:p>
-    <w:p>
-      <w:pPr>
-        <w:pStyle w:val="NoSpacing"/>
-        <w:ind w:firstLine="0"/>
+      </w:pPr>
+      <w:r>
         <w:rPr>
           <w:b/>
           <w:bCs/>
         </w:rPr>
-      </w:pPr>
-      <w:r>
-        <w:rPr>
-          <w:b/>
-          <w:bCs/>
-        </w:rPr>
         <w:t>Code Example: Button Click</w:t>
       </w:r>
     </w:p>
@@ -12459,23 +11432,7 @@
         <w:ind w:left="720"/>
       </w:pPr>
       <w:r>
-        <w:t>&lt;button id="</w:t>
-      </w:r>
-      <w:proofErr w:type="spellStart"/>
-      <w:r>
-        <w:t>myBtn</w:t>
-      </w:r>
-      <w:proofErr w:type="spellEnd"/>
-      <w:r>
-        <w:t xml:space="preserve">"&gt;Click </w:t>
-      </w:r>
-      <w:proofErr w:type="gramStart"/>
-      <w:r>
-        <w:t>Me!&lt;</w:t>
-      </w:r>
-      <w:proofErr w:type="gramEnd"/>
-      <w:r>
-        <w:t>/button&gt;</w:t>
+        <w:t>&lt;button id="myBtn"&gt;Click Me!&lt;/button&gt;</w:t>
       </w:r>
     </w:p>
     <w:p>
@@ -12513,25 +11470,7 @@
         <w:ind w:left="1440"/>
       </w:pPr>
       <w:r>
-        <w:t xml:space="preserve">const button = </w:t>
-      </w:r>
-      <w:proofErr w:type="spellStart"/>
-      <w:proofErr w:type="gramStart"/>
-      <w:r>
-        <w:t>document.getElementById</w:t>
-      </w:r>
-      <w:proofErr w:type="spellEnd"/>
-      <w:proofErr w:type="gramEnd"/>
-      <w:r>
-        <w:t>("</w:t>
-      </w:r>
-      <w:proofErr w:type="spellStart"/>
-      <w:r>
-        <w:t>myBtn</w:t>
-      </w:r>
-      <w:proofErr w:type="spellEnd"/>
-      <w:r>
-        <w:t>");</w:t>
+        <w:t>const button = document.getElementById("myBtn");</w:t>
       </w:r>
     </w:p>
     <w:p>
@@ -12540,17 +11479,7 @@
         <w:ind w:left="1440"/>
       </w:pPr>
       <w:r>
-        <w:t xml:space="preserve">const message = </w:t>
-      </w:r>
-      <w:proofErr w:type="spellStart"/>
-      <w:proofErr w:type="gramStart"/>
-      <w:r>
-        <w:t>document.getElementById</w:t>
-      </w:r>
-      <w:proofErr w:type="spellEnd"/>
-      <w:proofErr w:type="gramEnd"/>
-      <w:r>
-        <w:t>("message");</w:t>
+        <w:t>const message = document.getElementById("message");</w:t>
       </w:r>
     </w:p>
     <w:p>
@@ -12568,20 +11497,7 @@
         <w:ind w:left="1440"/>
       </w:pPr>
       <w:r>
-        <w:t xml:space="preserve">function </w:t>
-      </w:r>
-      <w:proofErr w:type="spellStart"/>
-      <w:proofErr w:type="gramStart"/>
-      <w:r>
-        <w:t>updateText</w:t>
-      </w:r>
-      <w:proofErr w:type="spellEnd"/>
-      <w:r>
-        <w:t>(</w:t>
-      </w:r>
-      <w:proofErr w:type="gramEnd"/>
-      <w:r>
-        <w:t>) {</w:t>
+        <w:t>function updateText() {</w:t>
       </w:r>
     </w:p>
     <w:p>
@@ -12590,17 +11506,7 @@
         <w:ind w:left="1440"/>
       </w:pPr>
       <w:r>
-        <w:t xml:space="preserve">    </w:t>
-      </w:r>
-      <w:proofErr w:type="spellStart"/>
-      <w:proofErr w:type="gramStart"/>
-      <w:r>
-        <w:t>message.innerText</w:t>
-      </w:r>
-      <w:proofErr w:type="spellEnd"/>
-      <w:proofErr w:type="gramEnd"/>
-      <w:r>
-        <w:t xml:space="preserve"> = "Button was clicked!";</w:t>
+        <w:t xml:space="preserve">    message.innerText = "Button was clicked!";</w:t>
       </w:r>
     </w:p>
     <w:p>
@@ -12626,23 +11532,8 @@
         <w:pStyle w:val="NoSpacing"/>
         <w:ind w:left="1440"/>
       </w:pPr>
-      <w:proofErr w:type="spellStart"/>
-      <w:proofErr w:type="gramStart"/>
-      <w:r>
-        <w:t>button.addEventListener</w:t>
-      </w:r>
-      <w:proofErr w:type="spellEnd"/>
-      <w:proofErr w:type="gramEnd"/>
-      <w:r>
-        <w:t xml:space="preserve">("click", </w:t>
-      </w:r>
-      <w:proofErr w:type="spellStart"/>
-      <w:r>
-        <w:t>updateText</w:t>
-      </w:r>
-      <w:proofErr w:type="spellEnd"/>
-      <w:r>
-        <w:t>);</w:t>
+      <w:r>
+        <w:t>button.addEventListener("click", updateText);</w:t>
       </w:r>
     </w:p>
     <w:p>
@@ -12761,21 +11652,7 @@
         <w:rPr>
           <w:rFonts w:eastAsiaTheme="majorEastAsia"/>
         </w:rPr>
-        <w:t> </w:t>
-      </w:r>
-      <w:proofErr w:type="spellStart"/>
-      <w:r>
-        <w:rPr>
-          <w:rFonts w:eastAsiaTheme="majorEastAsia"/>
-        </w:rPr>
-        <w:t>id</w:t>
-      </w:r>
-      <w:proofErr w:type="spellEnd"/>
-      <w:r>
-        <w:rPr>
-          <w:rFonts w:eastAsiaTheme="majorEastAsia"/>
-        </w:rPr>
-        <w:t> </w:t>
+        <w:t> id </w:t>
       </w:r>
       <w:r>
         <w:t>or</w:t>
@@ -12920,24 +11797,29 @@
         <w:pStyle w:val="NoSpacing"/>
         <w:ind w:left="1080"/>
       </w:pPr>
-      <w:proofErr w:type="spellStart"/>
-      <w:proofErr w:type="gramStart"/>
       <w:r>
         <w:rPr>
           <w:rFonts w:eastAsiaTheme="majorEastAsia"/>
         </w:rPr>
-        <w:t>document.getElementById</w:t>
-      </w:r>
-      <w:proofErr w:type="spellEnd"/>
-      <w:proofErr w:type="gramEnd"/>
+        <w:t>document.getElementById("id")</w:t>
+      </w:r>
+      <w:r>
+        <w:t>: Selects a single unique element.</w:t>
+      </w:r>
+    </w:p>
+    <w:p>
+      <w:pPr>
+        <w:pStyle w:val="NoSpacing"/>
+        <w:ind w:left="1080"/>
+      </w:pPr>
       <w:r>
         <w:rPr>
           <w:rFonts w:eastAsiaTheme="majorEastAsia"/>
         </w:rPr>
-        <w:t>("id")</w:t>
-      </w:r>
-      <w:r>
-        <w:t>: Selects a single unique element.</w:t>
+        <w:t>document.querySelector(".class")</w:t>
+      </w:r>
+      <w:r>
+        <w:t>: Selects the first element matching a CSS selector.</w:t>
       </w:r>
     </w:p>
     <w:p>
@@ -12945,46 +11827,11 @@
         <w:pStyle w:val="NoSpacing"/>
         <w:ind w:left="1080"/>
       </w:pPr>
-      <w:proofErr w:type="spellStart"/>
-      <w:proofErr w:type="gramStart"/>
       <w:r>
         <w:rPr>
           <w:rFonts w:eastAsiaTheme="majorEastAsia"/>
         </w:rPr>
-        <w:t>document.querySelector</w:t>
-      </w:r>
-      <w:proofErr w:type="spellEnd"/>
-      <w:proofErr w:type="gramEnd"/>
-      <w:r>
-        <w:rPr>
-          <w:rFonts w:eastAsiaTheme="majorEastAsia"/>
-        </w:rPr>
-        <w:t>(".class")</w:t>
-      </w:r>
-      <w:r>
-        <w:t>: Selects the first element matching a CSS selector.</w:t>
-      </w:r>
-    </w:p>
-    <w:p>
-      <w:pPr>
-        <w:pStyle w:val="NoSpacing"/>
-        <w:ind w:left="1080"/>
-      </w:pPr>
-      <w:proofErr w:type="spellStart"/>
-      <w:proofErr w:type="gramStart"/>
-      <w:r>
-        <w:rPr>
-          <w:rFonts w:eastAsiaTheme="majorEastAsia"/>
-        </w:rPr>
-        <w:t>document.querySelectorAll</w:t>
-      </w:r>
-      <w:proofErr w:type="spellEnd"/>
-      <w:proofErr w:type="gramEnd"/>
-      <w:r>
-        <w:rPr>
-          <w:rFonts w:eastAsiaTheme="majorEastAsia"/>
-        </w:rPr>
-        <w:t>("p")</w:t>
+        <w:t>document.querySelectorAll("p")</w:t>
       </w:r>
       <w:r>
         <w:t>: Selects all matching elements as a list.</w:t>
@@ -13021,24 +11868,29 @@
         <w:pStyle w:val="NoSpacing"/>
         <w:ind w:left="1080"/>
       </w:pPr>
-      <w:proofErr w:type="spellStart"/>
-      <w:proofErr w:type="gramStart"/>
       <w:r>
         <w:rPr>
           <w:rFonts w:eastAsiaTheme="majorEastAsia"/>
         </w:rPr>
-        <w:t>element.textContent</w:t>
-      </w:r>
-      <w:proofErr w:type="spellEnd"/>
-      <w:proofErr w:type="gramEnd"/>
+        <w:t>element.textContent = "Hello"</w:t>
+      </w:r>
+      <w:r>
+        <w:t>: Changes the text within an element.</w:t>
+      </w:r>
+    </w:p>
+    <w:p>
+      <w:pPr>
+        <w:pStyle w:val="NoSpacing"/>
+        <w:ind w:left="1080"/>
+      </w:pPr>
       <w:r>
         <w:rPr>
           <w:rFonts w:eastAsiaTheme="majorEastAsia"/>
         </w:rPr>
-        <w:t xml:space="preserve"> = "Hello"</w:t>
-      </w:r>
-      <w:r>
-        <w:t>: Changes the text within an element.</w:t>
+        <w:t>element.innerHTML = "&lt;b&gt;Bold&lt;/b&gt;"</w:t>
+      </w:r>
+      <w:r>
+        <w:t>: Changes the HTML content.</w:t>
       </w:r>
     </w:p>
     <w:p>
@@ -13046,52 +11898,11 @@
         <w:pStyle w:val="NoSpacing"/>
         <w:ind w:left="1080"/>
       </w:pPr>
-      <w:proofErr w:type="spellStart"/>
-      <w:proofErr w:type="gramStart"/>
       <w:r>
         <w:rPr>
           <w:rFonts w:eastAsiaTheme="majorEastAsia"/>
         </w:rPr>
-        <w:t>element.innerHTML</w:t>
-      </w:r>
-      <w:proofErr w:type="spellEnd"/>
-      <w:proofErr w:type="gramEnd"/>
-      <w:r>
-        <w:rPr>
-          <w:rFonts w:eastAsiaTheme="majorEastAsia"/>
-        </w:rPr>
-        <w:t xml:space="preserve"> = "&lt;b&gt;Bold&lt;/b&gt;"</w:t>
-      </w:r>
-      <w:r>
-        <w:t>: Changes the HTML content.</w:t>
-      </w:r>
-    </w:p>
-    <w:p>
-      <w:pPr>
-        <w:pStyle w:val="NoSpacing"/>
-        <w:ind w:left="1080"/>
-      </w:pPr>
-      <w:proofErr w:type="spellStart"/>
-      <w:proofErr w:type="gramStart"/>
-      <w:r>
-        <w:rPr>
-          <w:rFonts w:eastAsiaTheme="majorEastAsia"/>
-        </w:rPr>
-        <w:t>element.style</w:t>
-      </w:r>
-      <w:proofErr w:type="gramEnd"/>
-      <w:r>
-        <w:rPr>
-          <w:rFonts w:eastAsiaTheme="majorEastAsia"/>
-        </w:rPr>
-        <w:t>.color</w:t>
-      </w:r>
-      <w:proofErr w:type="spellEnd"/>
-      <w:r>
-        <w:rPr>
-          <w:rFonts w:eastAsiaTheme="majorEastAsia"/>
-        </w:rPr>
-        <w:t xml:space="preserve"> = "red"</w:t>
+        <w:t>element.style.color = "red"</w:t>
       </w:r>
       <w:r>
         <w:t>: Dynamically updates CSS properties.</w:t>
@@ -13128,24 +11939,29 @@
         <w:pStyle w:val="NoSpacing"/>
         <w:ind w:left="1080"/>
       </w:pPr>
-      <w:proofErr w:type="spellStart"/>
-      <w:proofErr w:type="gramStart"/>
       <w:r>
         <w:rPr>
           <w:rFonts w:eastAsiaTheme="majorEastAsia"/>
         </w:rPr>
-        <w:t>document.createElement</w:t>
-      </w:r>
-      <w:proofErr w:type="spellEnd"/>
-      <w:proofErr w:type="gramEnd"/>
+        <w:t>document.createElement("div")</w:t>
+      </w:r>
+      <w:r>
+        <w:t>: Generates a new element in memory.</w:t>
+      </w:r>
+    </w:p>
+    <w:p>
+      <w:pPr>
+        <w:pStyle w:val="NoSpacing"/>
+        <w:ind w:left="1080"/>
+      </w:pPr>
       <w:r>
         <w:rPr>
           <w:rFonts w:eastAsiaTheme="majorEastAsia"/>
         </w:rPr>
-        <w:t>("div")</w:t>
-      </w:r>
-      <w:r>
-        <w:t>: Generates a new element in memory.</w:t>
+        <w:t>parent.appendChild(newElement)</w:t>
+      </w:r>
+      <w:r>
+        <w:t>: Adds the new element to the page.</w:t>
       </w:r>
     </w:p>
     <w:p>
@@ -13153,60 +11969,11 @@
         <w:pStyle w:val="NoSpacing"/>
         <w:ind w:left="1080"/>
       </w:pPr>
-      <w:proofErr w:type="spellStart"/>
-      <w:proofErr w:type="gramStart"/>
       <w:r>
         <w:rPr>
           <w:rFonts w:eastAsiaTheme="majorEastAsia"/>
         </w:rPr>
-        <w:t>parent.appendChild</w:t>
-      </w:r>
-      <w:proofErr w:type="spellEnd"/>
-      <w:proofErr w:type="gramEnd"/>
-      <w:r>
-        <w:rPr>
-          <w:rFonts w:eastAsiaTheme="majorEastAsia"/>
-        </w:rPr>
-        <w:t>(</w:t>
-      </w:r>
-      <w:proofErr w:type="spellStart"/>
-      <w:r>
-        <w:rPr>
-          <w:rFonts w:eastAsiaTheme="majorEastAsia"/>
-        </w:rPr>
-        <w:t>newElement</w:t>
-      </w:r>
-      <w:proofErr w:type="spellEnd"/>
-      <w:r>
-        <w:rPr>
-          <w:rFonts w:eastAsiaTheme="majorEastAsia"/>
-        </w:rPr>
-        <w:t>)</w:t>
-      </w:r>
-      <w:r>
-        <w:t>: Adds the new element to the page.</w:t>
-      </w:r>
-    </w:p>
-    <w:p>
-      <w:pPr>
-        <w:pStyle w:val="NoSpacing"/>
-        <w:ind w:left="1080"/>
-      </w:pPr>
-      <w:proofErr w:type="spellStart"/>
-      <w:proofErr w:type="gramStart"/>
-      <w:r>
-        <w:rPr>
-          <w:rFonts w:eastAsiaTheme="majorEastAsia"/>
-        </w:rPr>
-        <w:t>element.remove</w:t>
-      </w:r>
-      <w:proofErr w:type="spellEnd"/>
-      <w:proofErr w:type="gramEnd"/>
-      <w:r>
-        <w:rPr>
-          <w:rFonts w:eastAsiaTheme="majorEastAsia"/>
-        </w:rPr>
-        <w:t>()</w:t>
+        <w:t>element.remove()</w:t>
       </w:r>
       <w:r>
         <w:t>: Deletes an element from the document.</w:t>
@@ -13243,21 +12010,11 @@
         <w:pStyle w:val="NoSpacing"/>
         <w:ind w:left="1800" w:firstLine="0"/>
       </w:pPr>
-      <w:proofErr w:type="spellStart"/>
-      <w:proofErr w:type="gramStart"/>
       <w:r>
         <w:rPr>
           <w:rFonts w:eastAsiaTheme="majorEastAsia"/>
         </w:rPr>
-        <w:t>element.addEventListener</w:t>
-      </w:r>
-      <w:proofErr w:type="spellEnd"/>
-      <w:proofErr w:type="gramEnd"/>
-      <w:r>
-        <w:rPr>
-          <w:rFonts w:eastAsiaTheme="majorEastAsia"/>
-        </w:rPr>
-        <w:t>("click", function)</w:t>
+        <w:t>element.addEventListener("click", function)</w:t>
       </w:r>
       <w:r>
         <w:t>: Triggers a function when a user clicks a button, submits a form, or hovers over an image.</w:t>
@@ -13269,46 +12026,7 @@
         <w:pStyle w:val="Heading3"/>
       </w:pPr>
       <w:r>
-        <w:t xml:space="preserve">Question 2: Explain the methods </w:t>
-      </w:r>
-      <w:proofErr w:type="spellStart"/>
-      <w:proofErr w:type="gramStart"/>
-      <w:r>
-        <w:t>getElementById</w:t>
-      </w:r>
-      <w:proofErr w:type="spellEnd"/>
-      <w:r>
-        <w:t>(</w:t>
-      </w:r>
-      <w:proofErr w:type="gramEnd"/>
-      <w:r>
-        <w:t xml:space="preserve">), </w:t>
-      </w:r>
-      <w:proofErr w:type="spellStart"/>
-      <w:proofErr w:type="gramStart"/>
-      <w:r>
-        <w:t>getElementsByClassName</w:t>
-      </w:r>
-      <w:proofErr w:type="spellEnd"/>
-      <w:r>
-        <w:t>(</w:t>
-      </w:r>
-      <w:proofErr w:type="gramEnd"/>
-      <w:r>
-        <w:t xml:space="preserve">), and </w:t>
-      </w:r>
-      <w:proofErr w:type="spellStart"/>
-      <w:proofErr w:type="gramStart"/>
-      <w:r>
-        <w:t>querySelector</w:t>
-      </w:r>
-      <w:proofErr w:type="spellEnd"/>
-      <w:r>
-        <w:t>(</w:t>
-      </w:r>
-      <w:proofErr w:type="gramEnd"/>
-      <w:r>
-        <w:t>) used to select elements from the DOM.</w:t>
+        <w:t>Question 2: Explain the methods getElementById(), getElementsByClassName(), and querySelector() used to select elements from the DOM.</w:t>
       </w:r>
     </w:p>
     <w:p/>
@@ -13357,35 +12075,7 @@
           <w:b/>
           <w:bCs/>
         </w:rPr>
-        <w:t> </w:t>
-      </w:r>
-      <w:proofErr w:type="spellStart"/>
-      <w:proofErr w:type="gramStart"/>
-      <w:r>
-        <w:rPr>
-          <w:rFonts w:eastAsiaTheme="majorEastAsia"/>
-          <w:b/>
-          <w:bCs/>
-        </w:rPr>
-        <w:t>getElementById</w:t>
-      </w:r>
-      <w:proofErr w:type="spellEnd"/>
-      <w:r>
-        <w:rPr>
-          <w:rFonts w:eastAsiaTheme="majorEastAsia"/>
-          <w:b/>
-          <w:bCs/>
-        </w:rPr>
-        <w:t>(</w:t>
-      </w:r>
-      <w:proofErr w:type="gramEnd"/>
-      <w:r>
-        <w:rPr>
-          <w:rFonts w:eastAsiaTheme="majorEastAsia"/>
-          <w:b/>
-          <w:bCs/>
-        </w:rPr>
-        <w:t>)</w:t>
+        <w:t> getElementById()</w:t>
       </w:r>
     </w:p>
     <w:p>
@@ -13520,15 +12210,7 @@
         <w:t>Performance:</w:t>
       </w:r>
       <w:r>
-        <w:t xml:space="preserve"> </w:t>
-      </w:r>
-      <w:proofErr w:type="gramStart"/>
-      <w:r>
-        <w:t>Generally</w:t>
-      </w:r>
-      <w:proofErr w:type="gramEnd"/>
-      <w:r>
-        <w:t xml:space="preserve"> the fastest method because browsers often use an internal map to track IDs.</w:t>
+        <w:t xml:space="preserve"> Generally the fastest method because browsers often use an internal map to track IDs.</w:t>
       </w:r>
     </w:p>
     <w:p>
@@ -13550,23 +12232,7 @@
         <w:rPr>
           <w:rFonts w:eastAsiaTheme="majorEastAsia"/>
         </w:rPr>
-        <w:t> </w:t>
-      </w:r>
-      <w:proofErr w:type="spellStart"/>
-      <w:proofErr w:type="gramStart"/>
-      <w:r>
-        <w:rPr>
-          <w:rFonts w:eastAsiaTheme="majorEastAsia"/>
-        </w:rPr>
-        <w:t>document.getElementById</w:t>
-      </w:r>
-      <w:proofErr w:type="spellEnd"/>
-      <w:proofErr w:type="gramEnd"/>
-      <w:r>
-        <w:rPr>
-          <w:rFonts w:eastAsiaTheme="majorEastAsia"/>
-        </w:rPr>
-        <w:t>("my-unique-id")</w:t>
+        <w:t> document.getElementById("my-unique-id")</w:t>
       </w:r>
       <w:r>
         <w:t>.</w:t>
@@ -13600,35 +12266,7 @@
           <w:b/>
           <w:bCs/>
         </w:rPr>
-        <w:t> </w:t>
-      </w:r>
-      <w:proofErr w:type="spellStart"/>
-      <w:proofErr w:type="gramStart"/>
-      <w:r>
-        <w:rPr>
-          <w:rFonts w:eastAsiaTheme="majorEastAsia"/>
-          <w:b/>
-          <w:bCs/>
-        </w:rPr>
-        <w:t>getElementsByClassName</w:t>
-      </w:r>
-      <w:proofErr w:type="spellEnd"/>
-      <w:r>
-        <w:rPr>
-          <w:rFonts w:eastAsiaTheme="majorEastAsia"/>
-          <w:b/>
-          <w:bCs/>
-        </w:rPr>
-        <w:t>(</w:t>
-      </w:r>
-      <w:proofErr w:type="gramEnd"/>
-      <w:r>
-        <w:rPr>
-          <w:rFonts w:eastAsiaTheme="majorEastAsia"/>
-          <w:b/>
-          <w:bCs/>
-        </w:rPr>
-        <w:t>)</w:t>
+        <w:t> getElementsByClassName()</w:t>
       </w:r>
     </w:p>
     <w:p>
@@ -13706,13 +12344,8 @@
         </w:rPr>
         <w:t> </w:t>
       </w:r>
-      <w:proofErr w:type="spellStart"/>
-      <w:r>
-        <w:t>HTMLCollection</w:t>
-      </w:r>
-      <w:proofErr w:type="spellEnd"/>
-      <w:r>
-        <w:t>. "Live" means if the DOM changes (e.g., a new element with that class is added later), the collection updates automatically.</w:t>
+      <w:r>
+        <w:t>HTMLCollection. "Live" means if the DOM changes (e.g., a new element with that class is added later), the collection updates automatically.</w:t>
       </w:r>
     </w:p>
     <w:p>
@@ -13737,16 +12370,8 @@
         <w:rPr>
           <w:rFonts w:eastAsiaTheme="majorEastAsia"/>
         </w:rPr>
-        <w:t> </w:t>
-      </w:r>
-      <w:proofErr w:type="spellStart"/>
-      <w:r>
-        <w:rPr>
-          <w:rFonts w:eastAsiaTheme="majorEastAsia"/>
-        </w:rPr>
-        <w:t>getElementById</w:t>
-      </w:r>
-      <w:proofErr w:type="spellEnd"/>
+        <w:t> getElementById</w:t>
+      </w:r>
       <w:r>
         <w:t>, this can be called on a specific element to search only within its children.</w:t>
       </w:r>
@@ -13770,23 +12395,7 @@
         <w:rPr>
           <w:rFonts w:eastAsiaTheme="majorEastAsia"/>
         </w:rPr>
-        <w:t> </w:t>
-      </w:r>
-      <w:proofErr w:type="spellStart"/>
-      <w:proofErr w:type="gramStart"/>
-      <w:r>
-        <w:rPr>
-          <w:rFonts w:eastAsiaTheme="majorEastAsia"/>
-        </w:rPr>
-        <w:t>document.getElementsByClassName</w:t>
-      </w:r>
-      <w:proofErr w:type="spellEnd"/>
-      <w:proofErr w:type="gramEnd"/>
-      <w:r>
-        <w:rPr>
-          <w:rFonts w:eastAsiaTheme="majorEastAsia"/>
-        </w:rPr>
-        <w:t>("my-class-name")</w:t>
+        <w:t> document.getElementsByClassName("my-class-name")</w:t>
       </w:r>
       <w:r>
         <w:t>.</w:t>
@@ -13820,35 +12429,7 @@
           <w:b/>
           <w:bCs/>
         </w:rPr>
-        <w:t> </w:t>
-      </w:r>
-      <w:proofErr w:type="spellStart"/>
-      <w:proofErr w:type="gramStart"/>
-      <w:r>
-        <w:rPr>
-          <w:rFonts w:eastAsiaTheme="majorEastAsia"/>
-          <w:b/>
-          <w:bCs/>
-        </w:rPr>
-        <w:t>querySelector</w:t>
-      </w:r>
-      <w:proofErr w:type="spellEnd"/>
-      <w:r>
-        <w:rPr>
-          <w:rFonts w:eastAsiaTheme="majorEastAsia"/>
-          <w:b/>
-          <w:bCs/>
-        </w:rPr>
-        <w:t>(</w:t>
-      </w:r>
-      <w:proofErr w:type="gramEnd"/>
-      <w:r>
-        <w:rPr>
-          <w:rFonts w:eastAsiaTheme="majorEastAsia"/>
-          <w:b/>
-          <w:bCs/>
-        </w:rPr>
-        <w:t>)</w:t>
+        <w:t> querySelector()</w:t>
       </w:r>
     </w:p>
     <w:p>
@@ -13905,23 +12486,7 @@
         <w:rPr>
           <w:rFonts w:eastAsiaTheme="majorEastAsia"/>
         </w:rPr>
-        <w:t xml:space="preserve"> "div &gt; </w:t>
-      </w:r>
-      <w:proofErr w:type="spellStart"/>
-      <w:proofErr w:type="gramStart"/>
-      <w:r>
-        <w:rPr>
-          <w:rFonts w:eastAsiaTheme="majorEastAsia"/>
-        </w:rPr>
-        <w:t>p.active</w:t>
-      </w:r>
-      <w:proofErr w:type="spellEnd"/>
-      <w:proofErr w:type="gramEnd"/>
-      <w:r>
-        <w:rPr>
-          <w:rFonts w:eastAsiaTheme="majorEastAsia"/>
-        </w:rPr>
-        <w:t>"</w:t>
+        <w:t> "div &gt; p.active"</w:t>
       </w:r>
       <w:r>
         <w:t>).</w:t>
@@ -14011,44 +12576,16 @@
         <w:rPr>
           <w:rFonts w:eastAsiaTheme="majorEastAsia"/>
         </w:rPr>
-        <w:t> </w:t>
-      </w:r>
-      <w:proofErr w:type="gramStart"/>
+        <w:t> document.querySelector(".my-class") </w:t>
+      </w:r>
+      <w:r>
+        <w:t>or</w:t>
+      </w:r>
       <w:r>
         <w:rPr>
           <w:rFonts w:eastAsiaTheme="majorEastAsia"/>
         </w:rPr>
-        <w:t>document.querySelector</w:t>
-      </w:r>
-      <w:proofErr w:type="gramEnd"/>
-      <w:r>
-        <w:rPr>
-          <w:rFonts w:eastAsiaTheme="majorEastAsia"/>
-        </w:rPr>
-        <w:t>(".my-class") </w:t>
-      </w:r>
-      <w:r>
-        <w:t>or</w:t>
-      </w:r>
-      <w:r>
-        <w:rPr>
-          <w:rFonts w:eastAsiaTheme="majorEastAsia"/>
-        </w:rPr>
-        <w:t> </w:t>
-      </w:r>
-      <w:proofErr w:type="gramStart"/>
-      <w:r>
-        <w:rPr>
-          <w:rFonts w:eastAsiaTheme="majorEastAsia"/>
-        </w:rPr>
-        <w:t>document.querySelector</w:t>
-      </w:r>
-      <w:proofErr w:type="gramEnd"/>
-      <w:r>
-        <w:rPr>
-          <w:rFonts w:eastAsiaTheme="majorEastAsia"/>
-        </w:rPr>
-        <w:t>("#my-id")</w:t>
+        <w:t> document.querySelector("#my-id")</w:t>
       </w:r>
       <w:r>
         <w:t>.</w:t>
@@ -14116,7 +12653,6 @@
                 <w:bCs/>
               </w:rPr>
             </w:pPr>
-            <w:proofErr w:type="spellStart"/>
             <w:r>
               <w:rPr>
                 <w:rFonts w:eastAsiaTheme="majorEastAsia"/>
@@ -14125,7 +12661,6 @@
               </w:rPr>
               <w:t>getElementById</w:t>
             </w:r>
-            <w:proofErr w:type="spellEnd"/>
           </w:p>
         </w:tc>
         <w:tc>
@@ -14144,7 +12679,6 @@
                 <w:bCs/>
               </w:rPr>
             </w:pPr>
-            <w:proofErr w:type="spellStart"/>
             <w:r>
               <w:rPr>
                 <w:rFonts w:eastAsiaTheme="majorEastAsia"/>
@@ -14153,7 +12687,6 @@
               </w:rPr>
               <w:t>getElementsByClassName</w:t>
             </w:r>
-            <w:proofErr w:type="spellEnd"/>
           </w:p>
         </w:tc>
         <w:tc>
@@ -14172,7 +12705,6 @@
                 <w:bCs/>
               </w:rPr>
             </w:pPr>
-            <w:proofErr w:type="spellStart"/>
             <w:r>
               <w:rPr>
                 <w:rFonts w:eastAsiaTheme="majorEastAsia"/>
@@ -14181,7 +12713,6 @@
               </w:rPr>
               <w:t>querySelector</w:t>
             </w:r>
-            <w:proofErr w:type="spellEnd"/>
           </w:p>
         </w:tc>
       </w:tr>
@@ -14308,16 +12839,8 @@
               <w:rPr>
                 <w:rFonts w:eastAsiaTheme="majorEastAsia"/>
               </w:rPr>
-              <w:t> </w:t>
+              <w:t> HTMLCollection</w:t>
             </w:r>
-            <w:proofErr w:type="spellStart"/>
-            <w:r>
-              <w:rPr>
-                <w:rFonts w:eastAsiaTheme="majorEastAsia"/>
-              </w:rPr>
-              <w:t>HTMLCollection</w:t>
-            </w:r>
-            <w:proofErr w:type="spellEnd"/>
           </w:p>
         </w:tc>
         <w:tc>
@@ -14490,23 +13013,7 @@
       </w:pPr>
       <w:r>
         <w:lastRenderedPageBreak/>
-        <w:t>JavaScript Timing Events (</w:t>
-      </w:r>
-      <w:proofErr w:type="spellStart"/>
-      <w:r>
-        <w:t>setTimeout</w:t>
-      </w:r>
-      <w:proofErr w:type="spellEnd"/>
-      <w:r>
-        <w:t xml:space="preserve">, </w:t>
-      </w:r>
-      <w:proofErr w:type="spellStart"/>
-      <w:r>
-        <w:t>setInterval</w:t>
-      </w:r>
-      <w:proofErr w:type="spellEnd"/>
-      <w:r>
-        <w:t>)</w:t>
+        <w:t>JavaScript Timing Events (setTimeout, setInterval)</w:t>
       </w:r>
     </w:p>
     <w:p>
@@ -14519,33 +13026,7 @@
         <w:pStyle w:val="Heading3"/>
       </w:pPr>
       <w:r>
-        <w:t xml:space="preserve">Question 1: Explain the </w:t>
-      </w:r>
-      <w:proofErr w:type="spellStart"/>
-      <w:proofErr w:type="gramStart"/>
-      <w:r>
-        <w:t>setTimeout</w:t>
-      </w:r>
-      <w:proofErr w:type="spellEnd"/>
-      <w:r>
-        <w:t>(</w:t>
-      </w:r>
-      <w:proofErr w:type="gramEnd"/>
-      <w:r>
-        <w:t xml:space="preserve">) and </w:t>
-      </w:r>
-      <w:proofErr w:type="spellStart"/>
-      <w:proofErr w:type="gramStart"/>
-      <w:r>
-        <w:t>setInterval</w:t>
-      </w:r>
-      <w:proofErr w:type="spellEnd"/>
-      <w:r>
-        <w:t>(</w:t>
-      </w:r>
-      <w:proofErr w:type="gramEnd"/>
-      <w:r>
-        <w:t>) functions in JavaScript. How are they used for timing events?</w:t>
+        <w:t>Question 1: Explain the setTimeout() and setInterval() functions in JavaScript. How are they used for timing events?</w:t>
       </w:r>
     </w:p>
     <w:p/>
@@ -14560,60 +13041,16 @@
         <w:rPr>
           <w:rFonts w:eastAsiaTheme="majorEastAsia"/>
         </w:rPr>
-        <w:t> </w:t>
-      </w:r>
-      <w:proofErr w:type="spellStart"/>
-      <w:proofErr w:type="gramStart"/>
+        <w:t> setTimeout() </w:t>
+      </w:r>
+      <w:r>
+        <w:t>and</w:t>
+      </w:r>
       <w:r>
         <w:rPr>
           <w:rFonts w:eastAsiaTheme="majorEastAsia"/>
         </w:rPr>
-        <w:t>setTimeout</w:t>
-      </w:r>
-      <w:proofErr w:type="spellEnd"/>
-      <w:r>
-        <w:rPr>
-          <w:rFonts w:eastAsiaTheme="majorEastAsia"/>
-        </w:rPr>
-        <w:t>(</w:t>
-      </w:r>
-      <w:proofErr w:type="gramEnd"/>
-      <w:r>
-        <w:rPr>
-          <w:rFonts w:eastAsiaTheme="majorEastAsia"/>
-        </w:rPr>
-        <w:t>) </w:t>
-      </w:r>
-      <w:r>
-        <w:t>and</w:t>
-      </w:r>
-      <w:r>
-        <w:rPr>
-          <w:rFonts w:eastAsiaTheme="majorEastAsia"/>
-        </w:rPr>
-        <w:t> </w:t>
-      </w:r>
-      <w:proofErr w:type="spellStart"/>
-      <w:proofErr w:type="gramStart"/>
-      <w:r>
-        <w:rPr>
-          <w:rFonts w:eastAsiaTheme="majorEastAsia"/>
-        </w:rPr>
-        <w:t>setInterval</w:t>
-      </w:r>
-      <w:proofErr w:type="spellEnd"/>
-      <w:r>
-        <w:rPr>
-          <w:rFonts w:eastAsiaTheme="majorEastAsia"/>
-        </w:rPr>
-        <w:t>(</w:t>
-      </w:r>
-      <w:proofErr w:type="gramEnd"/>
-      <w:r>
-        <w:rPr>
-          <w:rFonts w:eastAsiaTheme="majorEastAsia"/>
-        </w:rPr>
-        <w:t>) </w:t>
+        <w:t> setInterval() </w:t>
       </w:r>
       <w:r>
         <w:t>are</w:t>
@@ -14649,113 +13086,105 @@
           <w:b/>
           <w:bCs/>
         </w:rPr>
-        <w:t xml:space="preserve">1. </w:t>
-      </w:r>
-      <w:proofErr w:type="spellStart"/>
-      <w:proofErr w:type="gramStart"/>
+        <w:t>1. setTimeout()</w:t>
+      </w:r>
+    </w:p>
+    <w:p>
+      <w:pPr>
+        <w:pStyle w:val="NoSpacing"/>
+      </w:pPr>
+      <w:r>
+        <w:t>The</w:t>
+      </w:r>
+      <w:r>
+        <w:rPr>
+          <w:rFonts w:eastAsiaTheme="majorEastAsia"/>
+        </w:rPr>
+        <w:t> setTimeout() </w:t>
+      </w:r>
+      <w:r>
+        <w:t>method executes a function</w:t>
+      </w:r>
+      <w:r>
+        <w:rPr>
+          <w:rFonts w:eastAsiaTheme="majorEastAsia"/>
+        </w:rPr>
+        <w:t> once</w:t>
+      </w:r>
+      <w:r>
+        <w:t>after a specified delay in milliseconds (1 second = 1000 ms).</w:t>
+      </w:r>
+      <w:r>
+        <w:rPr>
+          <w:rFonts w:eastAsiaTheme="majorEastAsia"/>
+        </w:rPr>
+        <w:t> </w:t>
+      </w:r>
+    </w:p>
+    <w:p>
+      <w:pPr>
+        <w:pStyle w:val="NoSpacing"/>
+      </w:pPr>
       <w:r>
         <w:rPr>
           <w:rFonts w:eastAsiaTheme="majorEastAsia"/>
           <w:b/>
           <w:bCs/>
         </w:rPr>
-        <w:t>setTimeout</w:t>
-      </w:r>
-      <w:proofErr w:type="spellEnd"/>
+        <w:t>Syntax:</w:t>
+      </w:r>
+      <w:r>
+        <w:rPr>
+          <w:rFonts w:eastAsiaTheme="majorEastAsia"/>
+        </w:rPr>
+        <w:t> let timerId = setTimeout(function, delay, arg1, arg2, ...);</w:t>
+      </w:r>
+    </w:p>
+    <w:p>
+      <w:pPr>
+        <w:pStyle w:val="NoSpacing"/>
+      </w:pPr>
       <w:r>
         <w:rPr>
           <w:rFonts w:eastAsiaTheme="majorEastAsia"/>
           <w:b/>
           <w:bCs/>
         </w:rPr>
-        <w:t>(</w:t>
-      </w:r>
-      <w:proofErr w:type="gramEnd"/>
+        <w:t>How it works:</w:t>
+      </w:r>
+      <w:r>
+        <w:rPr>
+          <w:rFonts w:eastAsiaTheme="majorEastAsia"/>
+        </w:rPr>
+        <w:t> When called, it starts a timer in the background. Once the time is up, the function is added to the JavaScript Event Loop's task queue to be executed.</w:t>
+      </w:r>
+    </w:p>
+    <w:p>
+      <w:pPr>
+        <w:pStyle w:val="NoSpacing"/>
+      </w:pPr>
       <w:r>
         <w:rPr>
           <w:rFonts w:eastAsiaTheme="majorEastAsia"/>
           <w:b/>
           <w:bCs/>
         </w:rPr>
-        <w:t>)</w:t>
-      </w:r>
-    </w:p>
-    <w:p>
-      <w:pPr>
-        <w:pStyle w:val="NoSpacing"/>
-      </w:pPr>
-      <w:r>
-        <w:t>The</w:t>
+        <w:t>Clearing:</w:t>
       </w:r>
       <w:r>
         <w:rPr>
           <w:rFonts w:eastAsiaTheme="majorEastAsia"/>
         </w:rPr>
-        <w:t> </w:t>
-      </w:r>
-      <w:proofErr w:type="spellStart"/>
-      <w:proofErr w:type="gramStart"/>
-      <w:r>
-        <w:rPr>
-          <w:rFonts w:eastAsiaTheme="majorEastAsia"/>
-        </w:rPr>
-        <w:t>setTimeout</w:t>
-      </w:r>
-      <w:proofErr w:type="spellEnd"/>
-      <w:r>
-        <w:rPr>
-          <w:rFonts w:eastAsiaTheme="majorEastAsia"/>
-        </w:rPr>
-        <w:t>(</w:t>
-      </w:r>
-      <w:proofErr w:type="gramEnd"/>
-      <w:r>
-        <w:rPr>
-          <w:rFonts w:eastAsiaTheme="majorEastAsia"/>
-        </w:rPr>
-        <w:t>) </w:t>
-      </w:r>
-      <w:r>
-        <w:t>method executes a function</w:t>
-      </w:r>
-      <w:r>
-        <w:rPr>
-          <w:rFonts w:eastAsiaTheme="majorEastAsia"/>
-        </w:rPr>
-        <w:t> </w:t>
-      </w:r>
-      <w:proofErr w:type="spellStart"/>
-      <w:r>
-        <w:rPr>
-          <w:rFonts w:eastAsiaTheme="majorEastAsia"/>
-        </w:rPr>
-        <w:t>once</w:t>
-      </w:r>
-      <w:r>
-        <w:t>after</w:t>
-      </w:r>
-      <w:proofErr w:type="spellEnd"/>
-      <w:r>
-        <w:t xml:space="preserve"> a specified delay in milliseconds (1 second = 1000 </w:t>
-      </w:r>
-      <w:proofErr w:type="spellStart"/>
-      <w:r>
-        <w:t>ms</w:t>
-      </w:r>
-      <w:proofErr w:type="spellEnd"/>
-      <w:r>
-        <w:t>).</w:t>
-      </w:r>
-      <w:r>
-        <w:rPr>
-          <w:rFonts w:eastAsiaTheme="majorEastAsia"/>
-        </w:rPr>
-        <w:t> </w:t>
-      </w:r>
-    </w:p>
-    <w:p>
-      <w:pPr>
-        <w:pStyle w:val="NoSpacing"/>
+        <w:t> You can stop the execution before it happens by calling clearTimeout(timerId).</w:t>
+      </w:r>
+    </w:p>
+    <w:p>
+      <w:pPr>
+        <w:pStyle w:val="NoSpacing"/>
+        <w:rPr>
+          <w:b/>
+          <w:bCs/>
+        </w:rPr>
       </w:pPr>
       <w:r>
         <w:rPr>
@@ -14763,54 +13192,55 @@
           <w:b/>
           <w:bCs/>
         </w:rPr>
-        <w:t>Syntax:</w:t>
-      </w:r>
+        <w:t>Example:</w:t>
+      </w:r>
+    </w:p>
+    <w:p>
+      <w:pPr>
+        <w:pStyle w:val="NoSpacing"/>
+        <w:ind w:left="720"/>
+      </w:pPr>
+      <w:r>
+        <w:t>const greeting = setTimeout(() =&gt; {</w:t>
+      </w:r>
+    </w:p>
+    <w:p>
+      <w:pPr>
+        <w:pStyle w:val="NoSpacing"/>
+        <w:ind w:left="720"/>
+      </w:pPr>
+      <w:r>
+        <w:t xml:space="preserve">  console.log("Hello after 2 seconds!");</w:t>
+      </w:r>
+    </w:p>
+    <w:p>
+      <w:pPr>
+        <w:pStyle w:val="NoSpacing"/>
+        <w:ind w:left="720"/>
+      </w:pPr>
+      <w:r>
+        <w:t>}, 2000);</w:t>
+      </w:r>
+    </w:p>
+    <w:p>
+      <w:pPr>
+        <w:pStyle w:val="NoSpacing"/>
+      </w:pPr>
       <w:r>
         <w:rPr>
           <w:rFonts w:eastAsiaTheme="majorEastAsia"/>
         </w:rPr>
-        <w:t xml:space="preserve"> let </w:t>
-      </w:r>
-      <w:proofErr w:type="spellStart"/>
-      <w:r>
-        <w:rPr>
-          <w:rFonts w:eastAsiaTheme="majorEastAsia"/>
-        </w:rPr>
-        <w:t>timerId</w:t>
-      </w:r>
-      <w:proofErr w:type="spellEnd"/>
-      <w:r>
-        <w:rPr>
-          <w:rFonts w:eastAsiaTheme="majorEastAsia"/>
-        </w:rPr>
-        <w:t xml:space="preserve"> = </w:t>
-      </w:r>
-      <w:proofErr w:type="spellStart"/>
-      <w:proofErr w:type="gramStart"/>
-      <w:r>
-        <w:rPr>
-          <w:rFonts w:eastAsiaTheme="majorEastAsia"/>
-        </w:rPr>
-        <w:t>setTimeout</w:t>
-      </w:r>
-      <w:proofErr w:type="spellEnd"/>
-      <w:r>
-        <w:rPr>
-          <w:rFonts w:eastAsiaTheme="majorEastAsia"/>
-        </w:rPr>
-        <w:t>(</w:t>
-      </w:r>
-      <w:proofErr w:type="gramEnd"/>
-      <w:r>
-        <w:rPr>
-          <w:rFonts w:eastAsiaTheme="majorEastAsia"/>
-        </w:rPr>
-        <w:t>function, delay, arg1, arg2, ...);</w:t>
-      </w:r>
-    </w:p>
-    <w:p>
-      <w:pPr>
-        <w:pStyle w:val="NoSpacing"/>
+        <w:t> </w:t>
+      </w:r>
+    </w:p>
+    <w:p>
+      <w:pPr>
+        <w:pStyle w:val="NoSpacing"/>
+        <w:ind w:firstLine="0"/>
+        <w:rPr>
+          <w:b/>
+          <w:bCs/>
+        </w:rPr>
       </w:pPr>
       <w:r>
         <w:rPr>
@@ -14818,13 +13248,39 @@
           <w:b/>
           <w:bCs/>
         </w:rPr>
-        <w:t>How it works:</w:t>
+        <w:t>2. setInterval()</w:t>
+      </w:r>
+    </w:p>
+    <w:p>
+      <w:pPr>
+        <w:pStyle w:val="NoSpacing"/>
+      </w:pPr>
+      <w:r>
+        <w:t>The</w:t>
       </w:r>
       <w:r>
         <w:rPr>
           <w:rFonts w:eastAsiaTheme="majorEastAsia"/>
         </w:rPr>
-        <w:t> When called, it starts a timer in the background. Once the time is up, the function is added to the JavaScript Event Loop's task queue to be executed.</w:t>
+        <w:t> setInterval() </w:t>
+      </w:r>
+      <w:r>
+        <w:t>method executes a function</w:t>
+      </w:r>
+      <w:r>
+        <w:rPr>
+          <w:rFonts w:eastAsiaTheme="majorEastAsia"/>
+        </w:rPr>
+        <w:t> repeatedly</w:t>
+      </w:r>
+      <w:r>
+        <w:t>, with a fixed time delay between each call.</w:t>
+      </w:r>
+      <w:r>
+        <w:rPr>
+          <w:rFonts w:eastAsiaTheme="majorEastAsia"/>
+        </w:rPr>
+        <w:t> </w:t>
       </w:r>
     </w:p>
     <w:p>
@@ -14837,50 +13293,18 @@
           <w:b/>
           <w:bCs/>
         </w:rPr>
-        <w:t>Clearing:</w:t>
+        <w:t>Syntax:</w:t>
       </w:r>
       <w:r>
         <w:rPr>
           <w:rFonts w:eastAsiaTheme="majorEastAsia"/>
         </w:rPr>
-        <w:t> You can stop the execution before it happens by calling </w:t>
-      </w:r>
-      <w:proofErr w:type="spellStart"/>
-      <w:r>
-        <w:rPr>
-          <w:rFonts w:eastAsiaTheme="majorEastAsia"/>
-        </w:rPr>
-        <w:t>clearTimeout</w:t>
-      </w:r>
-      <w:proofErr w:type="spellEnd"/>
-      <w:r>
-        <w:rPr>
-          <w:rFonts w:eastAsiaTheme="majorEastAsia"/>
-        </w:rPr>
-        <w:t>(</w:t>
-      </w:r>
-      <w:proofErr w:type="spellStart"/>
-      <w:r>
-        <w:rPr>
-          <w:rFonts w:eastAsiaTheme="majorEastAsia"/>
-        </w:rPr>
-        <w:t>timerId</w:t>
-      </w:r>
-      <w:proofErr w:type="spellEnd"/>
-      <w:r>
-        <w:rPr>
-          <w:rFonts w:eastAsiaTheme="majorEastAsia"/>
-        </w:rPr>
-        <w:t>).</w:t>
-      </w:r>
-    </w:p>
-    <w:p>
-      <w:pPr>
-        <w:pStyle w:val="NoSpacing"/>
-        <w:rPr>
-          <w:b/>
-          <w:bCs/>
-        </w:rPr>
+        <w:t> let intervalId = setInterval(function, delay, arg1, arg2, ...);</w:t>
+      </w:r>
+    </w:p>
+    <w:p>
+      <w:pPr>
+        <w:pStyle w:val="NoSpacing"/>
       </w:pPr>
       <w:r>
         <w:rPr>
@@ -14888,76 +13312,18 @@
           <w:b/>
           <w:bCs/>
         </w:rPr>
-        <w:t>Example:</w:t>
-      </w:r>
-    </w:p>
-    <w:p>
-      <w:pPr>
-        <w:pStyle w:val="NoSpacing"/>
-        <w:ind w:left="720"/>
-      </w:pPr>
-      <w:r>
-        <w:t xml:space="preserve">const greeting = </w:t>
-      </w:r>
-      <w:proofErr w:type="spellStart"/>
-      <w:proofErr w:type="gramStart"/>
-      <w:r>
-        <w:t>setTimeout</w:t>
-      </w:r>
-      <w:proofErr w:type="spellEnd"/>
-      <w:r>
-        <w:t>(</w:t>
-      </w:r>
-      <w:proofErr w:type="gramEnd"/>
-      <w:r>
-        <w:t>() =&gt; {</w:t>
-      </w:r>
-    </w:p>
-    <w:p>
-      <w:pPr>
-        <w:pStyle w:val="NoSpacing"/>
-        <w:ind w:left="720"/>
-      </w:pPr>
-      <w:r>
-        <w:t xml:space="preserve">  </w:t>
-      </w:r>
-      <w:proofErr w:type="gramStart"/>
-      <w:r>
-        <w:t>console.log(</w:t>
-      </w:r>
-      <w:proofErr w:type="gramEnd"/>
-      <w:r>
-        <w:t>"Hello after 2 seconds!");</w:t>
-      </w:r>
-    </w:p>
-    <w:p>
-      <w:pPr>
-        <w:pStyle w:val="NoSpacing"/>
-        <w:ind w:left="720"/>
-      </w:pPr>
-      <w:r>
-        <w:t>}, 2000);</w:t>
-      </w:r>
-    </w:p>
-    <w:p>
-      <w:pPr>
-        <w:pStyle w:val="NoSpacing"/>
-      </w:pPr>
+        <w:t>How it works:</w:t>
+      </w:r>
       <w:r>
         <w:rPr>
           <w:rFonts w:eastAsiaTheme="majorEastAsia"/>
         </w:rPr>
-        <w:t> </w:t>
-      </w:r>
-    </w:p>
-    <w:p>
-      <w:pPr>
-        <w:pStyle w:val="NoSpacing"/>
-        <w:ind w:firstLine="0"/>
-        <w:rPr>
-          <w:b/>
-          <w:bCs/>
-        </w:rPr>
+        <w:t> It continuously schedules the function at regular intervals until it is explicitly stopped.</w:t>
+      </w:r>
+    </w:p>
+    <w:p>
+      <w:pPr>
+        <w:pStyle w:val="NoSpacing"/>
       </w:pPr>
       <w:r>
         <w:rPr>
@@ -14965,226 +13331,29 @@
           <w:b/>
           <w:bCs/>
         </w:rPr>
-        <w:t xml:space="preserve">2. </w:t>
-      </w:r>
-      <w:proofErr w:type="spellStart"/>
-      <w:proofErr w:type="gramStart"/>
+        <w:t>Clearing:</w:t>
+      </w:r>
+      <w:r>
+        <w:rPr>
+          <w:rFonts w:eastAsiaTheme="majorEastAsia"/>
+        </w:rPr>
+        <w:t> To stop the repetition, you must call clearInterval(intervalId).</w:t>
+      </w:r>
+    </w:p>
+    <w:p>
+      <w:pPr>
+        <w:pStyle w:val="NoSpacing"/>
+        <w:rPr>
+          <w:b/>
+          <w:bCs/>
+        </w:rPr>
+      </w:pPr>
       <w:r>
         <w:rPr>
           <w:rFonts w:eastAsiaTheme="majorEastAsia"/>
           <w:b/>
           <w:bCs/>
         </w:rPr>
-        <w:t>setInterval</w:t>
-      </w:r>
-      <w:proofErr w:type="spellEnd"/>
-      <w:r>
-        <w:rPr>
-          <w:rFonts w:eastAsiaTheme="majorEastAsia"/>
-          <w:b/>
-          <w:bCs/>
-        </w:rPr>
-        <w:t>(</w:t>
-      </w:r>
-      <w:proofErr w:type="gramEnd"/>
-      <w:r>
-        <w:rPr>
-          <w:rFonts w:eastAsiaTheme="majorEastAsia"/>
-          <w:b/>
-          <w:bCs/>
-        </w:rPr>
-        <w:t>)</w:t>
-      </w:r>
-    </w:p>
-    <w:p>
-      <w:pPr>
-        <w:pStyle w:val="NoSpacing"/>
-      </w:pPr>
-      <w:r>
-        <w:t>The</w:t>
-      </w:r>
-      <w:r>
-        <w:rPr>
-          <w:rFonts w:eastAsiaTheme="majorEastAsia"/>
-        </w:rPr>
-        <w:t> </w:t>
-      </w:r>
-      <w:proofErr w:type="spellStart"/>
-      <w:proofErr w:type="gramStart"/>
-      <w:r>
-        <w:rPr>
-          <w:rFonts w:eastAsiaTheme="majorEastAsia"/>
-        </w:rPr>
-        <w:t>setInterval</w:t>
-      </w:r>
-      <w:proofErr w:type="spellEnd"/>
-      <w:r>
-        <w:rPr>
-          <w:rFonts w:eastAsiaTheme="majorEastAsia"/>
-        </w:rPr>
-        <w:t>(</w:t>
-      </w:r>
-      <w:proofErr w:type="gramEnd"/>
-      <w:r>
-        <w:rPr>
-          <w:rFonts w:eastAsiaTheme="majorEastAsia"/>
-        </w:rPr>
-        <w:t>) </w:t>
-      </w:r>
-      <w:r>
-        <w:t>method executes a function</w:t>
-      </w:r>
-      <w:r>
-        <w:rPr>
-          <w:rFonts w:eastAsiaTheme="majorEastAsia"/>
-        </w:rPr>
-        <w:t> repeatedly</w:t>
-      </w:r>
-      <w:r>
-        <w:t>, with a fixed time delay between each call.</w:t>
-      </w:r>
-      <w:r>
-        <w:rPr>
-          <w:rFonts w:eastAsiaTheme="majorEastAsia"/>
-        </w:rPr>
-        <w:t> </w:t>
-      </w:r>
-    </w:p>
-    <w:p>
-      <w:pPr>
-        <w:pStyle w:val="NoSpacing"/>
-      </w:pPr>
-      <w:r>
-        <w:rPr>
-          <w:rFonts w:eastAsiaTheme="majorEastAsia"/>
-          <w:b/>
-          <w:bCs/>
-        </w:rPr>
-        <w:t>Syntax:</w:t>
-      </w:r>
-      <w:r>
-        <w:rPr>
-          <w:rFonts w:eastAsiaTheme="majorEastAsia"/>
-        </w:rPr>
-        <w:t xml:space="preserve"> let </w:t>
-      </w:r>
-      <w:proofErr w:type="spellStart"/>
-      <w:r>
-        <w:rPr>
-          <w:rFonts w:eastAsiaTheme="majorEastAsia"/>
-        </w:rPr>
-        <w:t>intervalId</w:t>
-      </w:r>
-      <w:proofErr w:type="spellEnd"/>
-      <w:r>
-        <w:rPr>
-          <w:rFonts w:eastAsiaTheme="majorEastAsia"/>
-        </w:rPr>
-        <w:t xml:space="preserve"> = </w:t>
-      </w:r>
-      <w:proofErr w:type="spellStart"/>
-      <w:proofErr w:type="gramStart"/>
-      <w:r>
-        <w:rPr>
-          <w:rFonts w:eastAsiaTheme="majorEastAsia"/>
-        </w:rPr>
-        <w:t>setInterval</w:t>
-      </w:r>
-      <w:proofErr w:type="spellEnd"/>
-      <w:r>
-        <w:rPr>
-          <w:rFonts w:eastAsiaTheme="majorEastAsia"/>
-        </w:rPr>
-        <w:t>(</w:t>
-      </w:r>
-      <w:proofErr w:type="gramEnd"/>
-      <w:r>
-        <w:rPr>
-          <w:rFonts w:eastAsiaTheme="majorEastAsia"/>
-        </w:rPr>
-        <w:t>function, delay, arg1, arg2, ...);</w:t>
-      </w:r>
-    </w:p>
-    <w:p>
-      <w:pPr>
-        <w:pStyle w:val="NoSpacing"/>
-      </w:pPr>
-      <w:r>
-        <w:rPr>
-          <w:rFonts w:eastAsiaTheme="majorEastAsia"/>
-          <w:b/>
-          <w:bCs/>
-        </w:rPr>
-        <w:t>How it works:</w:t>
-      </w:r>
-      <w:r>
-        <w:rPr>
-          <w:rFonts w:eastAsiaTheme="majorEastAsia"/>
-        </w:rPr>
-        <w:t> It continuously schedules the function at regular intervals until it is explicitly stopped.</w:t>
-      </w:r>
-    </w:p>
-    <w:p>
-      <w:pPr>
-        <w:pStyle w:val="NoSpacing"/>
-      </w:pPr>
-      <w:r>
-        <w:rPr>
-          <w:rFonts w:eastAsiaTheme="majorEastAsia"/>
-          <w:b/>
-          <w:bCs/>
-        </w:rPr>
-        <w:t>Clearing:</w:t>
-      </w:r>
-      <w:r>
-        <w:rPr>
-          <w:rFonts w:eastAsiaTheme="majorEastAsia"/>
-        </w:rPr>
-        <w:t> To stop the repetition, you must call </w:t>
-      </w:r>
-      <w:proofErr w:type="spellStart"/>
-      <w:r>
-        <w:rPr>
-          <w:rFonts w:eastAsiaTheme="majorEastAsia"/>
-        </w:rPr>
-        <w:t>clearInterval</w:t>
-      </w:r>
-      <w:proofErr w:type="spellEnd"/>
-      <w:r>
-        <w:rPr>
-          <w:rFonts w:eastAsiaTheme="majorEastAsia"/>
-        </w:rPr>
-        <w:t>(</w:t>
-      </w:r>
-      <w:proofErr w:type="spellStart"/>
-      <w:r>
-        <w:rPr>
-          <w:rFonts w:eastAsiaTheme="majorEastAsia"/>
-        </w:rPr>
-        <w:t>intervalId</w:t>
-      </w:r>
-      <w:proofErr w:type="spellEnd"/>
-      <w:r>
-        <w:rPr>
-          <w:rFonts w:eastAsiaTheme="majorEastAsia"/>
-        </w:rPr>
-        <w:t>).</w:t>
-      </w:r>
-    </w:p>
-    <w:p>
-      <w:pPr>
-        <w:pStyle w:val="NoSpacing"/>
-        <w:rPr>
-          <w:b/>
-          <w:bCs/>
-        </w:rPr>
-      </w:pPr>
-      <w:r>
-        <w:rPr>
-          <w:rFonts w:eastAsiaTheme="majorEastAsia"/>
-          <w:b/>
-          <w:bCs/>
-        </w:rPr>
         <w:t>Example:</w:t>
       </w:r>
     </w:p>
@@ -15203,20 +13372,7 @@
         <w:ind w:left="720"/>
       </w:pPr>
       <w:r>
-        <w:t xml:space="preserve">const counter = </w:t>
-      </w:r>
-      <w:proofErr w:type="spellStart"/>
-      <w:proofErr w:type="gramStart"/>
-      <w:r>
-        <w:t>setInterval</w:t>
-      </w:r>
-      <w:proofErr w:type="spellEnd"/>
-      <w:r>
-        <w:t>(</w:t>
-      </w:r>
-      <w:proofErr w:type="gramEnd"/>
-      <w:r>
-        <w:t>() =&gt; {</w:t>
+        <w:t>const counter = setInterval(() =&gt; {</w:t>
       </w:r>
     </w:p>
     <w:p>
@@ -15234,15 +13390,7 @@
         <w:ind w:left="720"/>
       </w:pPr>
       <w:r>
-        <w:t xml:space="preserve">  </w:t>
-      </w:r>
-      <w:proofErr w:type="gramStart"/>
-      <w:r>
-        <w:t>console.log(</w:t>
-      </w:r>
-      <w:proofErr w:type="gramEnd"/>
-      <w:r>
-        <w:t>`Interval count: ${count}`);</w:t>
+        <w:t xml:space="preserve">  console.log(`Interval count: ${count}`);</w:t>
       </w:r>
     </w:p>
     <w:p>
@@ -15251,15 +13399,7 @@
         <w:ind w:left="720"/>
       </w:pPr>
       <w:r>
-        <w:t xml:space="preserve">  if (count === 5) </w:t>
-      </w:r>
-      <w:proofErr w:type="spellStart"/>
-      <w:r>
-        <w:t>clearInterval</w:t>
-      </w:r>
-      <w:proofErr w:type="spellEnd"/>
-      <w:r>
-        <w:t>(counter); // Stop after 5 times</w:t>
+        <w:t xml:space="preserve">  if (count === 5) clearInterval(counter); // Stop after 5 times</w:t>
       </w:r>
     </w:p>
     <w:p>
@@ -15355,33 +13495,13 @@
                 <w:bCs/>
               </w:rPr>
             </w:pPr>
-            <w:proofErr w:type="spellStart"/>
-            <w:proofErr w:type="gramStart"/>
             <w:r>
               <w:rPr>
                 <w:rFonts w:eastAsiaTheme="majorEastAsia"/>
                 <w:b/>
                 <w:bCs/>
               </w:rPr>
-              <w:t>setTimeout</w:t>
-            </w:r>
-            <w:proofErr w:type="spellEnd"/>
-            <w:r>
-              <w:rPr>
-                <w:rFonts w:eastAsiaTheme="majorEastAsia"/>
-                <w:b/>
-                <w:bCs/>
-              </w:rPr>
-              <w:t>(</w:t>
-            </w:r>
-            <w:proofErr w:type="gramEnd"/>
-            <w:r>
-              <w:rPr>
-                <w:rFonts w:eastAsiaTheme="majorEastAsia"/>
-                <w:b/>
-                <w:bCs/>
-              </w:rPr>
-              <w:t>)</w:t>
+              <w:t>setTimeout()</w:t>
             </w:r>
           </w:p>
         </w:tc>
@@ -15401,33 +13521,13 @@
                 <w:bCs/>
               </w:rPr>
             </w:pPr>
-            <w:proofErr w:type="spellStart"/>
-            <w:proofErr w:type="gramStart"/>
             <w:r>
               <w:rPr>
                 <w:rFonts w:eastAsiaTheme="majorEastAsia"/>
                 <w:b/>
                 <w:bCs/>
               </w:rPr>
-              <w:t>setInterval</w:t>
-            </w:r>
-            <w:proofErr w:type="spellEnd"/>
-            <w:r>
-              <w:rPr>
-                <w:rFonts w:eastAsiaTheme="majorEastAsia"/>
-                <w:b/>
-                <w:bCs/>
-              </w:rPr>
-              <w:t>(</w:t>
-            </w:r>
-            <w:proofErr w:type="gramEnd"/>
-            <w:r>
-              <w:rPr>
-                <w:rFonts w:eastAsiaTheme="majorEastAsia"/>
-                <w:b/>
-                <w:bCs/>
-              </w:rPr>
-              <w:t>)</w:t>
+              <w:t>setInterval()</w:t>
             </w:r>
           </w:p>
         </w:tc>
@@ -15569,27 +13669,11 @@
               <w:pStyle w:val="NoSpacing"/>
               <w:ind w:hanging="22"/>
             </w:pPr>
-            <w:proofErr w:type="spellStart"/>
-            <w:proofErr w:type="gramStart"/>
             <w:r>
               <w:rPr>
                 <w:rFonts w:eastAsiaTheme="majorEastAsia"/>
               </w:rPr>
-              <w:t>clearTimeout</w:t>
-            </w:r>
-            <w:proofErr w:type="spellEnd"/>
-            <w:r>
-              <w:rPr>
-                <w:rFonts w:eastAsiaTheme="majorEastAsia"/>
-              </w:rPr>
-              <w:t>(</w:t>
-            </w:r>
-            <w:proofErr w:type="gramEnd"/>
-            <w:r>
-              <w:rPr>
-                <w:rFonts w:eastAsiaTheme="majorEastAsia"/>
-              </w:rPr>
-              <w:t>)</w:t>
+              <w:t>clearTimeout()</w:t>
             </w:r>
             <w:r>
               <w:t>.</w:t>
@@ -15607,27 +13691,11 @@
               <w:pStyle w:val="NoSpacing"/>
               <w:ind w:hanging="22"/>
             </w:pPr>
-            <w:proofErr w:type="spellStart"/>
-            <w:proofErr w:type="gramStart"/>
             <w:r>
               <w:rPr>
                 <w:rFonts w:eastAsiaTheme="majorEastAsia"/>
               </w:rPr>
-              <w:t>clearInterval</w:t>
-            </w:r>
-            <w:proofErr w:type="spellEnd"/>
-            <w:r>
-              <w:rPr>
-                <w:rFonts w:eastAsiaTheme="majorEastAsia"/>
-              </w:rPr>
-              <w:t>(</w:t>
-            </w:r>
-            <w:proofErr w:type="gramEnd"/>
-            <w:r>
-              <w:rPr>
-                <w:rFonts w:eastAsiaTheme="majorEastAsia"/>
-              </w:rPr>
-              <w:t>)</w:t>
+              <w:t>clearInterval()</w:t>
             </w:r>
             <w:r>
               <w:t>.</w:t>
@@ -15740,20 +13808,7 @@
         <w:pStyle w:val="Heading3"/>
       </w:pPr>
       <w:r>
-        <w:t xml:space="preserve">Question 2: Provide an example of how to use </w:t>
-      </w:r>
-      <w:proofErr w:type="spellStart"/>
-      <w:proofErr w:type="gramStart"/>
-      <w:r>
-        <w:t>setTimeout</w:t>
-      </w:r>
-      <w:proofErr w:type="spellEnd"/>
-      <w:r>
-        <w:t>(</w:t>
-      </w:r>
-      <w:proofErr w:type="gramEnd"/>
-      <w:r>
-        <w:t>) to delay an action by 2 seconds.</w:t>
+        <w:t>Question 2: Provide an example of how to use setTimeout() to delay an action by 2 seconds.</w:t>
       </w:r>
     </w:p>
     <w:p>
@@ -15772,29 +13827,7 @@
         <w:rPr>
           <w:rFonts w:eastAsiaTheme="majorEastAsia"/>
         </w:rPr>
-        <w:t> </w:t>
-      </w:r>
-      <w:proofErr w:type="spellStart"/>
-      <w:proofErr w:type="gramStart"/>
-      <w:r>
-        <w:rPr>
-          <w:rFonts w:eastAsiaTheme="majorEastAsia"/>
-        </w:rPr>
-        <w:t>setTimeout</w:t>
-      </w:r>
-      <w:proofErr w:type="spellEnd"/>
-      <w:r>
-        <w:rPr>
-          <w:rFonts w:eastAsiaTheme="majorEastAsia"/>
-        </w:rPr>
-        <w:t>(</w:t>
-      </w:r>
-      <w:proofErr w:type="gramEnd"/>
-      <w:r>
-        <w:rPr>
-          <w:rFonts w:eastAsiaTheme="majorEastAsia"/>
-        </w:rPr>
-        <w:t>) </w:t>
+        <w:t> setTimeout() </w:t>
       </w:r>
       <w:r>
         <w:t>function with a delay of</w:t>
@@ -15870,18 +13903,8 @@
         <w:pStyle w:val="NoSpacing"/>
         <w:ind w:left="1440"/>
       </w:pPr>
-      <w:proofErr w:type="spellStart"/>
-      <w:proofErr w:type="gramStart"/>
-      <w:r>
-        <w:t>setTimeout</w:t>
-      </w:r>
-      <w:proofErr w:type="spellEnd"/>
-      <w:r>
-        <w:t>(</w:t>
-      </w:r>
-      <w:proofErr w:type="gramEnd"/>
-      <w:r>
-        <w:t>() =&gt; {</w:t>
+      <w:r>
+        <w:t>setTimeout(() =&gt; {</w:t>
       </w:r>
     </w:p>
     <w:p>
@@ -15890,15 +13913,7 @@
         <w:ind w:left="1440"/>
       </w:pPr>
       <w:r>
-        <w:t xml:space="preserve">  </w:t>
-      </w:r>
-      <w:proofErr w:type="gramStart"/>
-      <w:r>
-        <w:t>console.log(</w:t>
-      </w:r>
-      <w:proofErr w:type="gramEnd"/>
-      <w:r>
-        <w:t>"This message appeared after 2 seconds!");</w:t>
+        <w:t xml:space="preserve">  console.log("This message appeared after 2 seconds!");</w:t>
       </w:r>
     </w:p>
     <w:p>
@@ -15960,21 +13975,7 @@
         <w:rPr>
           <w:rFonts w:eastAsiaTheme="majorEastAsia"/>
         </w:rPr>
-        <w:t xml:space="preserve"> () =&gt; </w:t>
-      </w:r>
-      <w:proofErr w:type="gramStart"/>
-      <w:r>
-        <w:rPr>
-          <w:rFonts w:eastAsiaTheme="majorEastAsia"/>
-        </w:rPr>
-        <w:t>{ ...</w:t>
-      </w:r>
-      <w:proofErr w:type="gramEnd"/>
-      <w:r>
-        <w:rPr>
-          <w:rFonts w:eastAsiaTheme="majorEastAsia"/>
-        </w:rPr>
-        <w:t xml:space="preserve"> }</w:t>
+        <w:t> () =&gt; { ... }</w:t>
       </w:r>
       <w:r>
         <w:t>).</w:t>
@@ -16056,21 +14057,7 @@
         <w:rPr>
           <w:rFonts w:eastAsiaTheme="majorEastAsia"/>
         </w:rPr>
-        <w:t> </w:t>
-      </w:r>
-      <w:proofErr w:type="spellStart"/>
-      <w:r>
-        <w:rPr>
-          <w:rFonts w:eastAsiaTheme="majorEastAsia"/>
-        </w:rPr>
-        <w:t>setTimeout</w:t>
-      </w:r>
-      <w:proofErr w:type="spellEnd"/>
-      <w:r>
-        <w:rPr>
-          <w:rFonts w:eastAsiaTheme="majorEastAsia"/>
-        </w:rPr>
-        <w:t> </w:t>
+        <w:t> setTimeout </w:t>
       </w:r>
       <w:r>
         <w:t>block will run immediately without waiting for the timer to finish.</w:t>
@@ -16126,15 +14113,7 @@
         <w:ind w:left="720"/>
       </w:pPr>
       <w:r>
-        <w:t xml:space="preserve">function </w:t>
-      </w:r>
-      <w:proofErr w:type="gramStart"/>
-      <w:r>
-        <w:t>greet(</w:t>
-      </w:r>
-      <w:proofErr w:type="gramEnd"/>
-      <w:r>
-        <w:t>) {</w:t>
+        <w:t>function greet() {</w:t>
       </w:r>
     </w:p>
     <w:p>
@@ -16143,15 +14122,7 @@
         <w:ind w:left="720"/>
       </w:pPr>
       <w:r>
-        <w:t xml:space="preserve">  </w:t>
-      </w:r>
-      <w:proofErr w:type="gramStart"/>
-      <w:r>
-        <w:t>console.log(</w:t>
-      </w:r>
-      <w:proofErr w:type="gramEnd"/>
-      <w:r>
-        <w:t>"Hello after 2 seconds!");</w:t>
+        <w:t xml:space="preserve">  console.log("Hello after 2 seconds!");</w:t>
       </w:r>
     </w:p>
     <w:p>
@@ -16168,15 +14139,7 @@
         <w:pStyle w:val="NoSpacing"/>
       </w:pPr>
       <w:r>
-        <w:t xml:space="preserve">// Pass the function name, NOT </w:t>
-      </w:r>
-      <w:proofErr w:type="gramStart"/>
-      <w:r>
-        <w:t>greet(</w:t>
-      </w:r>
-      <w:proofErr w:type="gramEnd"/>
-      <w:r>
-        <w:t>) with parentheses</w:t>
+        <w:t>// Pass the function name, NOT greet() with parentheses</w:t>
       </w:r>
     </w:p>
     <w:p>
@@ -16184,18 +14147,8 @@
         <w:pStyle w:val="NoSpacing"/>
         <w:ind w:left="720"/>
       </w:pPr>
-      <w:proofErr w:type="spellStart"/>
-      <w:proofErr w:type="gramStart"/>
-      <w:r>
-        <w:t>setTimeout</w:t>
-      </w:r>
-      <w:proofErr w:type="spellEnd"/>
-      <w:r>
-        <w:t>(</w:t>
-      </w:r>
-      <w:proofErr w:type="gramEnd"/>
-      <w:r>
-        <w:t>greet, 2000);</w:t>
+      <w:r>
+        <w:t>setTimeout(greet, 2000);</w:t>
       </w:r>
     </w:p>
     <w:p/>
@@ -16236,15 +14189,7 @@
         <w:pStyle w:val="Heading3"/>
       </w:pPr>
       <w:r>
-        <w:t xml:space="preserve">Question 1: What is error handling in JavaScript? Explain the try, catch, and finally </w:t>
-      </w:r>
-      <w:proofErr w:type="gramStart"/>
-      <w:r>
-        <w:t>blocks</w:t>
-      </w:r>
-      <w:proofErr w:type="gramEnd"/>
-      <w:r>
-        <w:t xml:space="preserve"> with an example.</w:t>
+        <w:t>Question 1: What is error handling in JavaScript? Explain the try, catch, and finally blocks with an example.</w:t>
       </w:r>
     </w:p>
     <w:p/>
@@ -16400,11 +14345,9 @@
         </w:rPr>
         <w:t> </w:t>
       </w:r>
-      <w:proofErr w:type="spellStart"/>
       <w:r>
         <w:t>tryand</w:t>
       </w:r>
-      <w:proofErr w:type="spellEnd"/>
       <w:r>
         <w:rPr>
           <w:rFonts w:eastAsiaTheme="majorEastAsia"/>
@@ -16466,20 +14409,7 @@
         <w:ind w:left="720"/>
       </w:pPr>
       <w:r>
-        <w:t xml:space="preserve">function </w:t>
-      </w:r>
-      <w:proofErr w:type="spellStart"/>
-      <w:proofErr w:type="gramStart"/>
-      <w:r>
-        <w:t>safeDivision</w:t>
-      </w:r>
-      <w:proofErr w:type="spellEnd"/>
-      <w:r>
-        <w:t>(</w:t>
-      </w:r>
-      <w:proofErr w:type="gramEnd"/>
-      <w:r>
-        <w:t>numerator, denominator) {</w:t>
+        <w:t>function safeDivision(numerator, denominator) {</w:t>
       </w:r>
     </w:p>
     <w:p>
@@ -16496,13 +14426,8 @@
         <w:pStyle w:val="NoSpacing"/>
         <w:ind w:left="1440"/>
       </w:pPr>
-      <w:proofErr w:type="gramStart"/>
-      <w:r>
-        <w:t>console.log(</w:t>
-      </w:r>
-      <w:proofErr w:type="gramEnd"/>
-      <w:r>
-        <w:t>"Starting division...");</w:t>
+      <w:r>
+        <w:t>console.log("Starting division...");</w:t>
       </w:r>
     </w:p>
     <w:p>
@@ -16529,15 +14454,7 @@
         <w:ind w:left="1440"/>
       </w:pPr>
       <w:r>
-        <w:t xml:space="preserve">throw new </w:t>
-      </w:r>
-      <w:proofErr w:type="gramStart"/>
-      <w:r>
-        <w:t>Error(</w:t>
-      </w:r>
-      <w:proofErr w:type="gramEnd"/>
-      <w:r>
-        <w:t xml:space="preserve">"Cannot divide by zero!"); </w:t>
+        <w:t xml:space="preserve">throw new Error("Cannot divide by zero!"); </w:t>
       </w:r>
     </w:p>
     <w:p>
@@ -16569,13 +14486,8 @@
         <w:pStyle w:val="NoSpacing"/>
         <w:ind w:left="1440"/>
       </w:pPr>
-      <w:proofErr w:type="gramStart"/>
-      <w:r>
-        <w:t>console.log(</w:t>
-      </w:r>
-      <w:proofErr w:type="gramEnd"/>
-      <w:r>
-        <w:t>"Result:", result);</w:t>
+      <w:r>
+        <w:t>console.log("Result:", result);</w:t>
       </w:r>
     </w:p>
     <w:p>
@@ -16604,25 +14516,8 @@
         <w:pStyle w:val="NoSpacing"/>
         <w:ind w:left="1440"/>
       </w:pPr>
-      <w:proofErr w:type="spellStart"/>
-      <w:proofErr w:type="gramStart"/>
-      <w:r>
-        <w:t>console.error</w:t>
-      </w:r>
-      <w:proofErr w:type="spellEnd"/>
-      <w:proofErr w:type="gramEnd"/>
-      <w:r>
-        <w:t xml:space="preserve">("Error caught:", </w:t>
-      </w:r>
-      <w:proofErr w:type="spellStart"/>
-      <w:proofErr w:type="gramStart"/>
-      <w:r>
-        <w:t>error.message</w:t>
-      </w:r>
-      <w:proofErr w:type="spellEnd"/>
-      <w:proofErr w:type="gramEnd"/>
-      <w:r>
-        <w:t>);</w:t>
+      <w:r>
+        <w:t>console.error("Error caught:", error.message);</w:t>
       </w:r>
     </w:p>
     <w:p>
@@ -16651,13 +14546,8 @@
         <w:pStyle w:val="NoSpacing"/>
         <w:ind w:left="1440"/>
       </w:pPr>
-      <w:proofErr w:type="gramStart"/>
-      <w:r>
-        <w:t>console.log(</w:t>
-      </w:r>
-      <w:proofErr w:type="gramEnd"/>
-      <w:r>
-        <w:t>"Process complete. Cleaning up resources...");</w:t>
+      <w:r>
+        <w:t>console.log("Process complete. Cleaning up resources...");</w:t>
       </w:r>
     </w:p>
     <w:p>
@@ -16701,18 +14591,8 @@
         <w:pStyle w:val="NoSpacing"/>
         <w:ind w:left="720"/>
       </w:pPr>
-      <w:proofErr w:type="spellStart"/>
-      <w:proofErr w:type="gramStart"/>
-      <w:r>
-        <w:t>safeDivision</w:t>
-      </w:r>
-      <w:proofErr w:type="spellEnd"/>
-      <w:r>
-        <w:t>(</w:t>
-      </w:r>
-      <w:proofErr w:type="gramEnd"/>
-      <w:r>
-        <w:t xml:space="preserve">10, 2); </w:t>
+      <w:r>
+        <w:t xml:space="preserve">safeDivision(10, 2); </w:t>
       </w:r>
     </w:p>
     <w:p>
@@ -16735,19 +14615,9 @@
         <w:pStyle w:val="NoSpacing"/>
         <w:ind w:left="720"/>
       </w:pPr>
-      <w:proofErr w:type="spellStart"/>
-      <w:proofErr w:type="gramStart"/>
       <w:r>
         <w:lastRenderedPageBreak/>
-        <w:t>safeDivision</w:t>
-      </w:r>
-      <w:proofErr w:type="spellEnd"/>
-      <w:r>
-        <w:t>(</w:t>
-      </w:r>
-      <w:proofErr w:type="gramEnd"/>
-      <w:r>
-        <w:t xml:space="preserve">10, 0); </w:t>
+        <w:t xml:space="preserve">safeDivision(10, 0); </w:t>
       </w:r>
     </w:p>
     <w:p/>

</xml_diff>